<commit_message>
fix- Sửa lại thông tin trên hợ đồng
</commit_message>
<xml_diff>
--- a/static/uploads/mau/hopdong/nt1/hd6t.docx
+++ b/static/uploads/mau/hopdong/nt1/hd6t.docx
@@ -84,14 +84,88 @@
                 <w:szCs w:val="24"/>
               </w:rPr>
             </w:pPr>
+            <w:proofErr w:type="spellStart"/>
             <w:r>
               <w:rPr>
                 <w:rFonts w:ascii="Times New Roman" w:hAnsi="Times New Roman"/>
                 <w:b/>
                 <w:szCs w:val="24"/>
               </w:rPr>
-              <w:t>Độc lập – Tự do – Hạnh phúc</w:t>
-            </w:r>
+              <w:t>Độc</w:t>
+            </w:r>
+            <w:proofErr w:type="spellEnd"/>
+            <w:r>
+              <w:rPr>
+                <w:rFonts w:ascii="Times New Roman" w:hAnsi="Times New Roman"/>
+                <w:b/>
+                <w:szCs w:val="24"/>
+              </w:rPr>
+              <w:t xml:space="preserve"> </w:t>
+            </w:r>
+            <w:proofErr w:type="spellStart"/>
+            <w:r>
+              <w:rPr>
+                <w:rFonts w:ascii="Times New Roman" w:hAnsi="Times New Roman"/>
+                <w:b/>
+                <w:szCs w:val="24"/>
+              </w:rPr>
+              <w:t>lập</w:t>
+            </w:r>
+            <w:proofErr w:type="spellEnd"/>
+            <w:r>
+              <w:rPr>
+                <w:rFonts w:ascii="Times New Roman" w:hAnsi="Times New Roman"/>
+                <w:b/>
+                <w:szCs w:val="24"/>
+              </w:rPr>
+              <w:t xml:space="preserve"> – </w:t>
+            </w:r>
+            <w:proofErr w:type="spellStart"/>
+            <w:r>
+              <w:rPr>
+                <w:rFonts w:ascii="Times New Roman" w:hAnsi="Times New Roman"/>
+                <w:b/>
+                <w:szCs w:val="24"/>
+              </w:rPr>
+              <w:t>Tự</w:t>
+            </w:r>
+            <w:proofErr w:type="spellEnd"/>
+            <w:r>
+              <w:rPr>
+                <w:rFonts w:ascii="Times New Roman" w:hAnsi="Times New Roman"/>
+                <w:b/>
+                <w:szCs w:val="24"/>
+              </w:rPr>
+              <w:t xml:space="preserve"> do – </w:t>
+            </w:r>
+            <w:proofErr w:type="spellStart"/>
+            <w:r>
+              <w:rPr>
+                <w:rFonts w:ascii="Times New Roman" w:hAnsi="Times New Roman"/>
+                <w:b/>
+                <w:szCs w:val="24"/>
+              </w:rPr>
+              <w:t>Hạnh</w:t>
+            </w:r>
+            <w:proofErr w:type="spellEnd"/>
+            <w:r>
+              <w:rPr>
+                <w:rFonts w:ascii="Times New Roman" w:hAnsi="Times New Roman"/>
+                <w:b/>
+                <w:szCs w:val="24"/>
+              </w:rPr>
+              <w:t xml:space="preserve"> </w:t>
+            </w:r>
+            <w:proofErr w:type="spellStart"/>
+            <w:r>
+              <w:rPr>
+                <w:rFonts w:ascii="Times New Roman" w:hAnsi="Times New Roman"/>
+                <w:b/>
+                <w:szCs w:val="24"/>
+              </w:rPr>
+              <w:t>phúc</w:t>
+            </w:r>
+            <w:proofErr w:type="spellEnd"/>
           </w:p>
         </w:tc>
       </w:tr>
@@ -219,7 +293,25 @@
                 <w:b w:val="0"/>
                 <w:szCs w:val="24"/>
               </w:rPr>
-              <w:t xml:space="preserve">                     Số: LC</w:t>
+              <w:t xml:space="preserve">                     </w:t>
+            </w:r>
+            <w:proofErr w:type="spellStart"/>
+            <w:r>
+              <w:rPr>
+                <w:rFonts w:ascii="Times New Roman" w:hAnsi="Times New Roman"/>
+                <w:b w:val="0"/>
+                <w:szCs w:val="24"/>
+              </w:rPr>
+              <w:t>Số</w:t>
+            </w:r>
+            <w:proofErr w:type="spellEnd"/>
+            <w:r>
+              <w:rPr>
+                <w:rFonts w:ascii="Times New Roman" w:hAnsi="Times New Roman"/>
+                <w:b w:val="0"/>
+                <w:szCs w:val="24"/>
+              </w:rPr>
+              <w:t>: LC</w:t>
             </w:r>
             <w:r>
               <w:rPr>
@@ -768,13 +860,63 @@
                 <w:lang w:val="nl-NL"/>
               </w:rPr>
             </w:pPr>
-            <w:r>
-              <w:rPr>
-                <w:rFonts w:ascii="Times New Roman" w:hAnsi="Times New Roman"/>
-                <w:szCs w:val="24"/>
-              </w:rPr>
-              <w:t>Ngày tháng năm sinh</w:t>
-            </w:r>
+            <w:proofErr w:type="spellStart"/>
+            <w:r>
+              <w:rPr>
+                <w:rFonts w:ascii="Times New Roman" w:hAnsi="Times New Roman"/>
+                <w:szCs w:val="24"/>
+              </w:rPr>
+              <w:t>Ngày</w:t>
+            </w:r>
+            <w:proofErr w:type="spellEnd"/>
+            <w:r>
+              <w:rPr>
+                <w:rFonts w:ascii="Times New Roman" w:hAnsi="Times New Roman"/>
+                <w:szCs w:val="24"/>
+              </w:rPr>
+              <w:t xml:space="preserve"> </w:t>
+            </w:r>
+            <w:proofErr w:type="spellStart"/>
+            <w:r>
+              <w:rPr>
+                <w:rFonts w:ascii="Times New Roman" w:hAnsi="Times New Roman"/>
+                <w:szCs w:val="24"/>
+              </w:rPr>
+              <w:t>tháng</w:t>
+            </w:r>
+            <w:proofErr w:type="spellEnd"/>
+            <w:r>
+              <w:rPr>
+                <w:rFonts w:ascii="Times New Roman" w:hAnsi="Times New Roman"/>
+                <w:szCs w:val="24"/>
+              </w:rPr>
+              <w:t xml:space="preserve"> </w:t>
+            </w:r>
+            <w:proofErr w:type="spellStart"/>
+            <w:r>
+              <w:rPr>
+                <w:rFonts w:ascii="Times New Roman" w:hAnsi="Times New Roman"/>
+                <w:szCs w:val="24"/>
+              </w:rPr>
+              <w:t>năm</w:t>
+            </w:r>
+            <w:proofErr w:type="spellEnd"/>
+            <w:r>
+              <w:rPr>
+                <w:rFonts w:ascii="Times New Roman" w:hAnsi="Times New Roman"/>
+                <w:szCs w:val="24"/>
+              </w:rPr>
+              <w:t xml:space="preserve"> </w:t>
+            </w:r>
+            <w:proofErr w:type="spellStart"/>
+            <w:r>
+              <w:rPr>
+                <w:rFonts w:ascii="Times New Roman" w:hAnsi="Times New Roman"/>
+                <w:szCs w:val="24"/>
+              </w:rPr>
+              <w:t>sinh</w:t>
+            </w:r>
+            <w:proofErr w:type="spellEnd"/>
           </w:p>
         </w:tc>
         <w:tc>
@@ -853,8 +995,17 @@
                 <w:rFonts w:ascii="Times New Roman" w:hAnsi="Times New Roman"/>
                 <w:szCs w:val="24"/>
               </w:rPr>
-              <w:t>Quốc tịch</w:t>
-            </w:r>
+              <w:t xml:space="preserve">Quốc </w:t>
+            </w:r>
+            <w:proofErr w:type="spellStart"/>
+            <w:r>
+              <w:rPr>
+                <w:rFonts w:ascii="Times New Roman" w:hAnsi="Times New Roman"/>
+                <w:szCs w:val="24"/>
+              </w:rPr>
+              <w:t>tịch</w:t>
+            </w:r>
+            <w:proofErr w:type="spellEnd"/>
           </w:p>
         </w:tc>
         <w:tc>
@@ -2421,20 +2572,120 @@
                 <w:lang w:val="fr-FR"/>
               </w:rPr>
             </w:pPr>
+            <w:proofErr w:type="spellStart"/>
             <w:r>
               <w:rPr>
                 <w:color w:val="000000"/>
                 <w:szCs w:val="24"/>
                 <w:lang w:val="fr-FR"/>
               </w:rPr>
-              <w:t xml:space="preserve">Hợp đồng xác định thời hạn </w:t>
-            </w:r>
+              <w:t>Hợp</w:t>
+            </w:r>
+            <w:proofErr w:type="spellEnd"/>
             <w:r>
               <w:rPr>
                 <w:color w:val="000000"/>
                 <w:szCs w:val="24"/>
                 <w:lang w:val="fr-FR"/>
               </w:rPr>
+              <w:t xml:space="preserve"> </w:t>
+            </w:r>
+            <w:proofErr w:type="spellStart"/>
+            <w:r>
+              <w:rPr>
+                <w:color w:val="000000"/>
+                <w:szCs w:val="24"/>
+                <w:lang w:val="fr-FR"/>
+              </w:rPr>
+              <w:t>đồng</w:t>
+            </w:r>
+            <w:proofErr w:type="spellEnd"/>
+            <w:r>
+              <w:rPr>
+                <w:color w:val="000000"/>
+                <w:szCs w:val="24"/>
+                <w:lang w:val="fr-FR"/>
+              </w:rPr>
+              <w:t xml:space="preserve"> </w:t>
+            </w:r>
+            <w:proofErr w:type="spellStart"/>
+            <w:r>
+              <w:rPr>
+                <w:color w:val="000000"/>
+                <w:szCs w:val="24"/>
+                <w:lang w:val="fr-FR"/>
+              </w:rPr>
+              <w:t>xác</w:t>
+            </w:r>
+            <w:proofErr w:type="spellEnd"/>
+            <w:r>
+              <w:rPr>
+                <w:color w:val="000000"/>
+                <w:szCs w:val="24"/>
+                <w:lang w:val="fr-FR"/>
+              </w:rPr>
+              <w:t xml:space="preserve"> </w:t>
+            </w:r>
+            <w:proofErr w:type="spellStart"/>
+            <w:r>
+              <w:rPr>
+                <w:color w:val="000000"/>
+                <w:szCs w:val="24"/>
+                <w:lang w:val="fr-FR"/>
+              </w:rPr>
+              <w:t>định</w:t>
+            </w:r>
+            <w:proofErr w:type="spellEnd"/>
+            <w:r>
+              <w:rPr>
+                <w:color w:val="000000"/>
+                <w:szCs w:val="24"/>
+                <w:lang w:val="fr-FR"/>
+              </w:rPr>
+              <w:t xml:space="preserve"> </w:t>
+            </w:r>
+            <w:proofErr w:type="spellStart"/>
+            <w:r>
+              <w:rPr>
+                <w:color w:val="000000"/>
+                <w:szCs w:val="24"/>
+                <w:lang w:val="fr-FR"/>
+              </w:rPr>
+              <w:t>thời</w:t>
+            </w:r>
+            <w:proofErr w:type="spellEnd"/>
+            <w:r>
+              <w:rPr>
+                <w:color w:val="000000"/>
+                <w:szCs w:val="24"/>
+                <w:lang w:val="fr-FR"/>
+              </w:rPr>
+              <w:t xml:space="preserve"> </w:t>
+            </w:r>
+            <w:proofErr w:type="spellStart"/>
+            <w:r>
+              <w:rPr>
+                <w:color w:val="000000"/>
+                <w:szCs w:val="24"/>
+                <w:lang w:val="fr-FR"/>
+              </w:rPr>
+              <w:t>hạn</w:t>
+            </w:r>
+            <w:proofErr w:type="spellEnd"/>
+            <w:r>
+              <w:rPr>
+                <w:color w:val="000000"/>
+                <w:szCs w:val="24"/>
+                <w:lang w:val="fr-FR"/>
+              </w:rPr>
+              <w:t xml:space="preserve"> </w:t>
+            </w:r>
+            <w:r>
+              <w:rPr>
+                <w:color w:val="000000"/>
+                <w:szCs w:val="24"/>
+                <w:lang w:val="fr-FR"/>
+              </w:rPr>
               <w:t>06</w:t>
             </w:r>
             <w:r>
@@ -2443,8 +2694,18 @@
                 <w:szCs w:val="24"/>
                 <w:lang w:val="fr-FR"/>
               </w:rPr>
-              <w:t xml:space="preserve"> tháng</w:t>
-            </w:r>
+              <w:t xml:space="preserve"> </w:t>
+            </w:r>
+            <w:proofErr w:type="spellStart"/>
+            <w:r>
+              <w:rPr>
+                <w:color w:val="000000"/>
+                <w:szCs w:val="24"/>
+                <w:lang w:val="fr-FR"/>
+              </w:rPr>
+              <w:t>tháng</w:t>
+            </w:r>
+            <w:proofErr w:type="spellEnd"/>
           </w:p>
           <w:p>
             <w:pPr>
@@ -2456,13 +2717,41 @@
                 <w:lang w:val="fr-FR"/>
               </w:rPr>
             </w:pPr>
-            <w:r>
-              <w:rPr>
-                <w:rFonts w:ascii="Times New Roman" w:hAnsi="Times New Roman"/>
-                <w:szCs w:val="24"/>
-                <w:lang w:val="fr-FR"/>
-              </w:rPr>
-              <w:t xml:space="preserve">Từ ngày </w:t>
+            <w:proofErr w:type="spellStart"/>
+            <w:r>
+              <w:rPr>
+                <w:rFonts w:ascii="Times New Roman" w:hAnsi="Times New Roman"/>
+                <w:szCs w:val="24"/>
+                <w:lang w:val="fr-FR"/>
+              </w:rPr>
+              <w:t>Từ</w:t>
+            </w:r>
+            <w:proofErr w:type="spellEnd"/>
+            <w:r>
+              <w:rPr>
+                <w:rFonts w:ascii="Times New Roman" w:hAnsi="Times New Roman"/>
+                <w:szCs w:val="24"/>
+                <w:lang w:val="fr-FR"/>
+              </w:rPr>
+              <w:t xml:space="preserve"> </w:t>
+            </w:r>
+            <w:proofErr w:type="spellStart"/>
+            <w:r>
+              <w:rPr>
+                <w:rFonts w:ascii="Times New Roman" w:hAnsi="Times New Roman"/>
+                <w:szCs w:val="24"/>
+                <w:lang w:val="fr-FR"/>
+              </w:rPr>
+              <w:t>ngày</w:t>
+            </w:r>
+            <w:proofErr w:type="spellEnd"/>
+            <w:r>
+              <w:rPr>
+                <w:rFonts w:ascii="Times New Roman" w:hAnsi="Times New Roman"/>
+                <w:szCs w:val="24"/>
+                <w:lang w:val="fr-FR"/>
+              </w:rPr>
+              <w:t xml:space="preserve"> </w:t>
             </w:r>
             <w:r>
               <w:rPr>
@@ -2471,13 +2760,33 @@
                 <w:szCs w:val="24"/>
                 <w:lang w:val="fr-FR"/>
               </w:rPr>
-              <w:t>{{ngaylamhopdong}}</w:t>
-            </w:r>
+              <w:t>{{</w:t>
+            </w:r>
+            <w:proofErr w:type="spellStart"/>
             <w:r>
               <w:rPr>
                 <w:rFonts w:ascii="Times New Roman" w:hAnsi="Times New Roman"/>
                 <w:i/>
                 <w:szCs w:val="24"/>
+                <w:lang w:val="fr-FR"/>
+              </w:rPr>
+              <w:t>ngaylamhopdong</w:t>
+            </w:r>
+            <w:proofErr w:type="spellEnd"/>
+            <w:r>
+              <w:rPr>
+                <w:rFonts w:ascii="Times New Roman" w:hAnsi="Times New Roman"/>
+                <w:i/>
+                <w:szCs w:val="24"/>
+                <w:lang w:val="fr-FR"/>
+              </w:rPr>
+              <w:t>}}</w:t>
+            </w:r>
+            <w:r>
+              <w:rPr>
+                <w:rFonts w:ascii="Times New Roman" w:hAnsi="Times New Roman"/>
+                <w:i/>
+                <w:szCs w:val="24"/>
                 <w:lang w:val="vi-VN"/>
               </w:rPr>
               <w:t xml:space="preserve"> </w:t>
@@ -2498,13 +2807,33 @@
                 <w:szCs w:val="24"/>
                 <w:lang w:val="fr-FR"/>
               </w:rPr>
-              <w:t>{{thanglamhopdong}}</w:t>
-            </w:r>
+              <w:t>{{</w:t>
+            </w:r>
+            <w:proofErr w:type="spellStart"/>
             <w:r>
               <w:rPr>
                 <w:rFonts w:ascii="Times New Roman" w:hAnsi="Times New Roman"/>
                 <w:i/>
                 <w:szCs w:val="24"/>
+                <w:lang w:val="fr-FR"/>
+              </w:rPr>
+              <w:t>thanglamhopdong</w:t>
+            </w:r>
+            <w:proofErr w:type="spellEnd"/>
+            <w:r>
+              <w:rPr>
+                <w:rFonts w:ascii="Times New Roman" w:hAnsi="Times New Roman"/>
+                <w:i/>
+                <w:szCs w:val="24"/>
+                <w:lang w:val="fr-FR"/>
+              </w:rPr>
+              <w:t>}}</w:t>
+            </w:r>
+            <w:r>
+              <w:rPr>
+                <w:rFonts w:ascii="Times New Roman" w:hAnsi="Times New Roman"/>
+                <w:i/>
+                <w:szCs w:val="24"/>
                 <w:lang w:val="vi-VN"/>
               </w:rPr>
               <w:t xml:space="preserve"> năm </w:t>
@@ -2516,8 +2845,29 @@
                 <w:szCs w:val="24"/>
                 <w:lang w:val="fr-FR"/>
               </w:rPr>
-              <w:t xml:space="preserve">{{namlamhopdong}} </w:t>
-            </w:r>
+              <w:t>{{</w:t>
+            </w:r>
+            <w:proofErr w:type="spellStart"/>
+            <w:r>
+              <w:rPr>
+                <w:rFonts w:ascii="Times New Roman" w:hAnsi="Times New Roman"/>
+                <w:i/>
+                <w:szCs w:val="24"/>
+                <w:lang w:val="fr-FR"/>
+              </w:rPr>
+              <w:t>namlamhopdong</w:t>
+            </w:r>
+            <w:proofErr w:type="spellEnd"/>
+            <w:r>
+              <w:rPr>
+                <w:rFonts w:ascii="Times New Roman" w:hAnsi="Times New Roman"/>
+                <w:i/>
+                <w:szCs w:val="24"/>
+                <w:lang w:val="fr-FR"/>
+              </w:rPr>
+              <w:t xml:space="preserve">}} </w:t>
+            </w:r>
+            <w:proofErr w:type="spellStart"/>
             <w:r>
               <w:rPr>
                 <w:rFonts w:ascii="Times New Roman" w:hAnsi="Times New Roman" w:hint="eastAsia"/>
@@ -2532,7 +2882,52 @@
                 <w:szCs w:val="24"/>
                 <w:lang w:val="fr-FR"/>
               </w:rPr>
-              <w:t xml:space="preserve">ến hết ngày </w:t>
+              <w:t>ến</w:t>
+            </w:r>
+            <w:proofErr w:type="spellEnd"/>
+            <w:r>
+              <w:rPr>
+                <w:rFonts w:ascii="Times New Roman" w:hAnsi="Times New Roman"/>
+                <w:szCs w:val="24"/>
+                <w:lang w:val="fr-FR"/>
+              </w:rPr>
+              <w:t xml:space="preserve"> </w:t>
+            </w:r>
+            <w:proofErr w:type="spellStart"/>
+            <w:r>
+              <w:rPr>
+                <w:rFonts w:ascii="Times New Roman" w:hAnsi="Times New Roman"/>
+                <w:szCs w:val="24"/>
+                <w:lang w:val="fr-FR"/>
+              </w:rPr>
+              <w:t>hết</w:t>
+            </w:r>
+            <w:proofErr w:type="spellEnd"/>
+            <w:r>
+              <w:rPr>
+                <w:rFonts w:ascii="Times New Roman" w:hAnsi="Times New Roman"/>
+                <w:szCs w:val="24"/>
+                <w:lang w:val="fr-FR"/>
+              </w:rPr>
+              <w:t xml:space="preserve"> </w:t>
+            </w:r>
+            <w:proofErr w:type="spellStart"/>
+            <w:r>
+              <w:rPr>
+                <w:rFonts w:ascii="Times New Roman" w:hAnsi="Times New Roman"/>
+                <w:szCs w:val="24"/>
+                <w:lang w:val="fr-FR"/>
+              </w:rPr>
+              <w:t>ngày</w:t>
+            </w:r>
+            <w:proofErr w:type="spellEnd"/>
+            <w:r>
+              <w:rPr>
+                <w:rFonts w:ascii="Times New Roman" w:hAnsi="Times New Roman"/>
+                <w:szCs w:val="24"/>
+                <w:lang w:val="fr-FR"/>
+              </w:rPr>
+              <w:t xml:space="preserve"> </w:t>
             </w:r>
             <w:r>
               <w:rPr>
@@ -2541,13 +2936,33 @@
                 <w:szCs w:val="24"/>
                 <w:lang w:val="fr-FR"/>
               </w:rPr>
-              <w:t>{{ngayketthuchopdong}}</w:t>
-            </w:r>
+              <w:t>{{</w:t>
+            </w:r>
+            <w:proofErr w:type="spellStart"/>
             <w:r>
               <w:rPr>
                 <w:rFonts w:ascii="Times New Roman" w:hAnsi="Times New Roman"/>
                 <w:i/>
                 <w:szCs w:val="24"/>
+                <w:lang w:val="fr-FR"/>
+              </w:rPr>
+              <w:t>ngayketthuchopdong</w:t>
+            </w:r>
+            <w:proofErr w:type="spellEnd"/>
+            <w:r>
+              <w:rPr>
+                <w:rFonts w:ascii="Times New Roman" w:hAnsi="Times New Roman"/>
+                <w:i/>
+                <w:szCs w:val="24"/>
+                <w:lang w:val="fr-FR"/>
+              </w:rPr>
+              <w:t>}}</w:t>
+            </w:r>
+            <w:r>
+              <w:rPr>
+                <w:rFonts w:ascii="Times New Roman" w:hAnsi="Times New Roman"/>
+                <w:i/>
+                <w:szCs w:val="24"/>
                 <w:lang w:val="vi-VN"/>
               </w:rPr>
               <w:t xml:space="preserve"> </w:t>
@@ -2568,13 +2983,33 @@
                 <w:szCs w:val="24"/>
                 <w:lang w:val="fr-FR"/>
               </w:rPr>
-              <w:t>{{thangketthuchopdong}}</w:t>
-            </w:r>
+              <w:t>{{</w:t>
+            </w:r>
+            <w:proofErr w:type="spellStart"/>
             <w:r>
               <w:rPr>
                 <w:rFonts w:ascii="Times New Roman" w:hAnsi="Times New Roman"/>
                 <w:i/>
                 <w:szCs w:val="24"/>
+                <w:lang w:val="fr-FR"/>
+              </w:rPr>
+              <w:t>thangketthuchopdong</w:t>
+            </w:r>
+            <w:proofErr w:type="spellEnd"/>
+            <w:r>
+              <w:rPr>
+                <w:rFonts w:ascii="Times New Roman" w:hAnsi="Times New Roman"/>
+                <w:i/>
+                <w:szCs w:val="24"/>
+                <w:lang w:val="fr-FR"/>
+              </w:rPr>
+              <w:t>}}</w:t>
+            </w:r>
+            <w:r>
+              <w:rPr>
+                <w:rFonts w:ascii="Times New Roman" w:hAnsi="Times New Roman"/>
+                <w:i/>
+                <w:szCs w:val="24"/>
                 <w:lang w:val="vi-VN"/>
               </w:rPr>
               <w:t xml:space="preserve"> năm </w:t>
@@ -2586,7 +3021,27 @@
                 <w:szCs w:val="24"/>
                 <w:lang w:val="fr-FR"/>
               </w:rPr>
-              <w:t>{{namketthuchopdong}}</w:t>
+              <w:t>{{</w:t>
+            </w:r>
+            <w:proofErr w:type="spellStart"/>
+            <w:r>
+              <w:rPr>
+                <w:rFonts w:ascii="Times New Roman" w:hAnsi="Times New Roman"/>
+                <w:i/>
+                <w:szCs w:val="24"/>
+                <w:lang w:val="fr-FR"/>
+              </w:rPr>
+              <w:t>namketthuchopdong</w:t>
+            </w:r>
+            <w:proofErr w:type="spellEnd"/>
+            <w:r>
+              <w:rPr>
+                <w:rFonts w:ascii="Times New Roman" w:hAnsi="Times New Roman"/>
+                <w:i/>
+                <w:szCs w:val="24"/>
+                <w:lang w:val="fr-FR"/>
+              </w:rPr>
+              <w:t>}}</w:t>
             </w:r>
           </w:p>
         </w:tc>
@@ -2627,14 +3082,88 @@
                 <w:lang w:val="fr-FR"/>
               </w:rPr>
             </w:pPr>
-            <w:r>
-              <w:rPr>
-                <w:rFonts w:ascii="Times New Roman" w:hAnsi="Times New Roman"/>
-                <w:szCs w:val="24"/>
-                <w:lang w:val="fr-FR"/>
-              </w:rPr>
-              <w:t>Địa điểm làm việc chính</w:t>
-            </w:r>
+            <w:proofErr w:type="spellStart"/>
+            <w:r>
+              <w:rPr>
+                <w:rFonts w:ascii="Times New Roman" w:hAnsi="Times New Roman"/>
+                <w:szCs w:val="24"/>
+                <w:lang w:val="fr-FR"/>
+              </w:rPr>
+              <w:t>Địa</w:t>
+            </w:r>
+            <w:proofErr w:type="spellEnd"/>
+            <w:r>
+              <w:rPr>
+                <w:rFonts w:ascii="Times New Roman" w:hAnsi="Times New Roman"/>
+                <w:szCs w:val="24"/>
+                <w:lang w:val="fr-FR"/>
+              </w:rPr>
+              <w:t xml:space="preserve"> </w:t>
+            </w:r>
+            <w:proofErr w:type="spellStart"/>
+            <w:r>
+              <w:rPr>
+                <w:rFonts w:ascii="Times New Roman" w:hAnsi="Times New Roman"/>
+                <w:szCs w:val="24"/>
+                <w:lang w:val="fr-FR"/>
+              </w:rPr>
+              <w:t>điểm</w:t>
+            </w:r>
+            <w:proofErr w:type="spellEnd"/>
+            <w:r>
+              <w:rPr>
+                <w:rFonts w:ascii="Times New Roman" w:hAnsi="Times New Roman"/>
+                <w:szCs w:val="24"/>
+                <w:lang w:val="fr-FR"/>
+              </w:rPr>
+              <w:t xml:space="preserve"> </w:t>
+            </w:r>
+            <w:proofErr w:type="spellStart"/>
+            <w:r>
+              <w:rPr>
+                <w:rFonts w:ascii="Times New Roman" w:hAnsi="Times New Roman"/>
+                <w:szCs w:val="24"/>
+                <w:lang w:val="fr-FR"/>
+              </w:rPr>
+              <w:t>làm</w:t>
+            </w:r>
+            <w:proofErr w:type="spellEnd"/>
+            <w:r>
+              <w:rPr>
+                <w:rFonts w:ascii="Times New Roman" w:hAnsi="Times New Roman"/>
+                <w:szCs w:val="24"/>
+                <w:lang w:val="fr-FR"/>
+              </w:rPr>
+              <w:t xml:space="preserve"> </w:t>
+            </w:r>
+            <w:proofErr w:type="spellStart"/>
+            <w:r>
+              <w:rPr>
+                <w:rFonts w:ascii="Times New Roman" w:hAnsi="Times New Roman"/>
+                <w:szCs w:val="24"/>
+                <w:lang w:val="fr-FR"/>
+              </w:rPr>
+              <w:t>việc</w:t>
+            </w:r>
+            <w:proofErr w:type="spellEnd"/>
+            <w:r>
+              <w:rPr>
+                <w:rFonts w:ascii="Times New Roman" w:hAnsi="Times New Roman"/>
+                <w:szCs w:val="24"/>
+                <w:lang w:val="fr-FR"/>
+              </w:rPr>
+              <w:t xml:space="preserve"> </w:t>
+            </w:r>
+            <w:proofErr w:type="spellStart"/>
+            <w:r>
+              <w:rPr>
+                <w:rFonts w:ascii="Times New Roman" w:hAnsi="Times New Roman"/>
+                <w:szCs w:val="24"/>
+                <w:lang w:val="fr-FR"/>
+              </w:rPr>
+              <w:t>chính</w:t>
+            </w:r>
+            <w:proofErr w:type="spellEnd"/>
           </w:p>
         </w:tc>
         <w:tc>
@@ -2682,16 +3211,181 @@
                 <w:szCs w:val="24"/>
                 <w:lang w:val="fr-FR"/>
               </w:rPr>
-              <w:t xml:space="preserve">+ Tại trụ sở của Công ty Cổ phần </w:t>
-            </w:r>
-            <w:r>
-              <w:rPr>
-                <w:rFonts w:ascii="Times New Roman" w:hAnsi="Times New Roman"/>
-                <w:szCs w:val="24"/>
-                <w:lang w:val="fr-FR"/>
-              </w:rPr>
-              <w:t>Sản xuất Nam Thuận</w:t>
-            </w:r>
+              <w:t xml:space="preserve">+ </w:t>
+            </w:r>
+            <w:proofErr w:type="spellStart"/>
+            <w:r>
+              <w:rPr>
+                <w:rFonts w:ascii="Times New Roman" w:hAnsi="Times New Roman"/>
+                <w:szCs w:val="24"/>
+                <w:lang w:val="fr-FR"/>
+              </w:rPr>
+              <w:t>Tại</w:t>
+            </w:r>
+            <w:proofErr w:type="spellEnd"/>
+            <w:r>
+              <w:rPr>
+                <w:rFonts w:ascii="Times New Roman" w:hAnsi="Times New Roman"/>
+                <w:szCs w:val="24"/>
+                <w:lang w:val="fr-FR"/>
+              </w:rPr>
+              <w:t xml:space="preserve"> </w:t>
+            </w:r>
+            <w:proofErr w:type="spellStart"/>
+            <w:r>
+              <w:rPr>
+                <w:rFonts w:ascii="Times New Roman" w:hAnsi="Times New Roman"/>
+                <w:szCs w:val="24"/>
+                <w:lang w:val="fr-FR"/>
+              </w:rPr>
+              <w:t>trụ</w:t>
+            </w:r>
+            <w:proofErr w:type="spellEnd"/>
+            <w:r>
+              <w:rPr>
+                <w:rFonts w:ascii="Times New Roman" w:hAnsi="Times New Roman"/>
+                <w:szCs w:val="24"/>
+                <w:lang w:val="fr-FR"/>
+              </w:rPr>
+              <w:t xml:space="preserve"> </w:t>
+            </w:r>
+            <w:proofErr w:type="spellStart"/>
+            <w:r>
+              <w:rPr>
+                <w:rFonts w:ascii="Times New Roman" w:hAnsi="Times New Roman"/>
+                <w:szCs w:val="24"/>
+                <w:lang w:val="fr-FR"/>
+              </w:rPr>
+              <w:t>sở</w:t>
+            </w:r>
+            <w:proofErr w:type="spellEnd"/>
+            <w:r>
+              <w:rPr>
+                <w:rFonts w:ascii="Times New Roman" w:hAnsi="Times New Roman"/>
+                <w:szCs w:val="24"/>
+                <w:lang w:val="fr-FR"/>
+              </w:rPr>
+              <w:t xml:space="preserve"> </w:t>
+            </w:r>
+            <w:proofErr w:type="spellStart"/>
+            <w:r>
+              <w:rPr>
+                <w:rFonts w:ascii="Times New Roman" w:hAnsi="Times New Roman"/>
+                <w:szCs w:val="24"/>
+                <w:lang w:val="fr-FR"/>
+              </w:rPr>
+              <w:t>của</w:t>
+            </w:r>
+            <w:proofErr w:type="spellEnd"/>
+            <w:r>
+              <w:rPr>
+                <w:rFonts w:ascii="Times New Roman" w:hAnsi="Times New Roman"/>
+                <w:szCs w:val="24"/>
+                <w:lang w:val="fr-FR"/>
+              </w:rPr>
+              <w:t xml:space="preserve"> Công </w:t>
+            </w:r>
+            <w:proofErr w:type="spellStart"/>
+            <w:r>
+              <w:rPr>
+                <w:rFonts w:ascii="Times New Roman" w:hAnsi="Times New Roman"/>
+                <w:szCs w:val="24"/>
+                <w:lang w:val="fr-FR"/>
+              </w:rPr>
+              <w:t>ty</w:t>
+            </w:r>
+            <w:proofErr w:type="spellEnd"/>
+            <w:r>
+              <w:rPr>
+                <w:rFonts w:ascii="Times New Roman" w:hAnsi="Times New Roman"/>
+                <w:szCs w:val="24"/>
+                <w:lang w:val="fr-FR"/>
+              </w:rPr>
+              <w:t xml:space="preserve"> </w:t>
+            </w:r>
+            <w:proofErr w:type="spellStart"/>
+            <w:r>
+              <w:rPr>
+                <w:rFonts w:ascii="Times New Roman" w:hAnsi="Times New Roman"/>
+                <w:szCs w:val="24"/>
+                <w:lang w:val="fr-FR"/>
+              </w:rPr>
+              <w:t>Cổ</w:t>
+            </w:r>
+            <w:proofErr w:type="spellEnd"/>
+            <w:r>
+              <w:rPr>
+                <w:rFonts w:ascii="Times New Roman" w:hAnsi="Times New Roman"/>
+                <w:szCs w:val="24"/>
+                <w:lang w:val="fr-FR"/>
+              </w:rPr>
+              <w:t xml:space="preserve"> </w:t>
+            </w:r>
+            <w:proofErr w:type="spellStart"/>
+            <w:r>
+              <w:rPr>
+                <w:rFonts w:ascii="Times New Roman" w:hAnsi="Times New Roman"/>
+                <w:szCs w:val="24"/>
+                <w:lang w:val="fr-FR"/>
+              </w:rPr>
+              <w:t>phần</w:t>
+            </w:r>
+            <w:proofErr w:type="spellEnd"/>
+            <w:r>
+              <w:rPr>
+                <w:rFonts w:ascii="Times New Roman" w:hAnsi="Times New Roman"/>
+                <w:szCs w:val="24"/>
+                <w:lang w:val="fr-FR"/>
+              </w:rPr>
+              <w:t xml:space="preserve"> </w:t>
+            </w:r>
+            <w:proofErr w:type="spellStart"/>
+            <w:r>
+              <w:rPr>
+                <w:rFonts w:ascii="Times New Roman" w:hAnsi="Times New Roman"/>
+                <w:szCs w:val="24"/>
+                <w:lang w:val="fr-FR"/>
+              </w:rPr>
+              <w:t>Sản</w:t>
+            </w:r>
+            <w:proofErr w:type="spellEnd"/>
+            <w:r>
+              <w:rPr>
+                <w:rFonts w:ascii="Times New Roman" w:hAnsi="Times New Roman"/>
+                <w:szCs w:val="24"/>
+                <w:lang w:val="fr-FR"/>
+              </w:rPr>
+              <w:t xml:space="preserve"> </w:t>
+            </w:r>
+            <w:proofErr w:type="spellStart"/>
+            <w:r>
+              <w:rPr>
+                <w:rFonts w:ascii="Times New Roman" w:hAnsi="Times New Roman"/>
+                <w:szCs w:val="24"/>
+                <w:lang w:val="fr-FR"/>
+              </w:rPr>
+              <w:t>xuất</w:t>
+            </w:r>
+            <w:proofErr w:type="spellEnd"/>
+            <w:r>
+              <w:rPr>
+                <w:rFonts w:ascii="Times New Roman" w:hAnsi="Times New Roman"/>
+                <w:szCs w:val="24"/>
+                <w:lang w:val="fr-FR"/>
+              </w:rPr>
+              <w:t xml:space="preserve"> Nam </w:t>
+            </w:r>
+            <w:proofErr w:type="spellStart"/>
+            <w:proofErr w:type="gramStart"/>
+            <w:r>
+              <w:rPr>
+                <w:rFonts w:ascii="Times New Roman" w:hAnsi="Times New Roman"/>
+                <w:szCs w:val="24"/>
+                <w:lang w:val="fr-FR"/>
+              </w:rPr>
+              <w:t>Thuận</w:t>
+            </w:r>
+            <w:proofErr w:type="spellEnd"/>
             <w:r>
               <w:rPr>
                 <w:rFonts w:ascii="Times New Roman" w:hAnsi="Times New Roman"/>
@@ -2700,6 +3394,7 @@
               </w:rPr>
               <w:t>:</w:t>
             </w:r>
+            <w:proofErr w:type="gramEnd"/>
             <w:r>
               <w:rPr>
                 <w:rFonts w:ascii="Times New Roman" w:hAnsi="Times New Roman"/>
@@ -2718,14 +3413,160 @@
                 <w:lang w:val="fr-FR"/>
               </w:rPr>
             </w:pPr>
-            <w:r>
-              <w:rPr>
-                <w:rFonts w:ascii="Times New Roman" w:hAnsi="Times New Roman"/>
-                <w:szCs w:val="24"/>
-                <w:lang w:val="fr-FR"/>
-              </w:rPr>
-              <w:t>Tổ dân phố Thủy Sơn 7, phường Thủy Nguyên, thành phố Hải Phòng</w:t>
-            </w:r>
+            <w:proofErr w:type="spellStart"/>
+            <w:r>
+              <w:rPr>
+                <w:rFonts w:ascii="Times New Roman" w:hAnsi="Times New Roman"/>
+                <w:szCs w:val="24"/>
+                <w:lang w:val="fr-FR"/>
+              </w:rPr>
+              <w:t>Tổ</w:t>
+            </w:r>
+            <w:proofErr w:type="spellEnd"/>
+            <w:r>
+              <w:rPr>
+                <w:rFonts w:ascii="Times New Roman" w:hAnsi="Times New Roman"/>
+                <w:szCs w:val="24"/>
+                <w:lang w:val="fr-FR"/>
+              </w:rPr>
+              <w:t xml:space="preserve"> </w:t>
+            </w:r>
+            <w:proofErr w:type="spellStart"/>
+            <w:r>
+              <w:rPr>
+                <w:rFonts w:ascii="Times New Roman" w:hAnsi="Times New Roman"/>
+                <w:szCs w:val="24"/>
+                <w:lang w:val="fr-FR"/>
+              </w:rPr>
+              <w:t>dân</w:t>
+            </w:r>
+            <w:proofErr w:type="spellEnd"/>
+            <w:r>
+              <w:rPr>
+                <w:rFonts w:ascii="Times New Roman" w:hAnsi="Times New Roman"/>
+                <w:szCs w:val="24"/>
+                <w:lang w:val="fr-FR"/>
+              </w:rPr>
+              <w:t xml:space="preserve"> </w:t>
+            </w:r>
+            <w:proofErr w:type="spellStart"/>
+            <w:r>
+              <w:rPr>
+                <w:rFonts w:ascii="Times New Roman" w:hAnsi="Times New Roman"/>
+                <w:szCs w:val="24"/>
+                <w:lang w:val="fr-FR"/>
+              </w:rPr>
+              <w:t>phố</w:t>
+            </w:r>
+            <w:proofErr w:type="spellEnd"/>
+            <w:r>
+              <w:rPr>
+                <w:rFonts w:ascii="Times New Roman" w:hAnsi="Times New Roman"/>
+                <w:szCs w:val="24"/>
+                <w:lang w:val="fr-FR"/>
+              </w:rPr>
+              <w:t xml:space="preserve"> </w:t>
+            </w:r>
+            <w:proofErr w:type="spellStart"/>
+            <w:r>
+              <w:rPr>
+                <w:rFonts w:ascii="Times New Roman" w:hAnsi="Times New Roman"/>
+                <w:szCs w:val="24"/>
+                <w:lang w:val="fr-FR"/>
+              </w:rPr>
+              <w:t>Thủy</w:t>
+            </w:r>
+            <w:proofErr w:type="spellEnd"/>
+            <w:r>
+              <w:rPr>
+                <w:rFonts w:ascii="Times New Roman" w:hAnsi="Times New Roman"/>
+                <w:szCs w:val="24"/>
+                <w:lang w:val="fr-FR"/>
+              </w:rPr>
+              <w:t xml:space="preserve"> Sơn 7, </w:t>
+            </w:r>
+            <w:proofErr w:type="spellStart"/>
+            <w:r>
+              <w:rPr>
+                <w:rFonts w:ascii="Times New Roman" w:hAnsi="Times New Roman"/>
+                <w:szCs w:val="24"/>
+                <w:lang w:val="fr-FR"/>
+              </w:rPr>
+              <w:t>phường</w:t>
+            </w:r>
+            <w:proofErr w:type="spellEnd"/>
+            <w:r>
+              <w:rPr>
+                <w:rFonts w:ascii="Times New Roman" w:hAnsi="Times New Roman"/>
+                <w:szCs w:val="24"/>
+                <w:lang w:val="fr-FR"/>
+              </w:rPr>
+              <w:t xml:space="preserve"> </w:t>
+            </w:r>
+            <w:proofErr w:type="spellStart"/>
+            <w:r>
+              <w:rPr>
+                <w:rFonts w:ascii="Times New Roman" w:hAnsi="Times New Roman"/>
+                <w:szCs w:val="24"/>
+                <w:lang w:val="fr-FR"/>
+              </w:rPr>
+              <w:t>Thủy</w:t>
+            </w:r>
+            <w:proofErr w:type="spellEnd"/>
+            <w:r>
+              <w:rPr>
+                <w:rFonts w:ascii="Times New Roman" w:hAnsi="Times New Roman"/>
+                <w:szCs w:val="24"/>
+                <w:lang w:val="fr-FR"/>
+              </w:rPr>
+              <w:t xml:space="preserve"> Nguyên, </w:t>
+            </w:r>
+            <w:proofErr w:type="spellStart"/>
+            <w:r>
+              <w:rPr>
+                <w:rFonts w:ascii="Times New Roman" w:hAnsi="Times New Roman"/>
+                <w:szCs w:val="24"/>
+                <w:lang w:val="fr-FR"/>
+              </w:rPr>
+              <w:t>thành</w:t>
+            </w:r>
+            <w:proofErr w:type="spellEnd"/>
+            <w:r>
+              <w:rPr>
+                <w:rFonts w:ascii="Times New Roman" w:hAnsi="Times New Roman"/>
+                <w:szCs w:val="24"/>
+                <w:lang w:val="fr-FR"/>
+              </w:rPr>
+              <w:t xml:space="preserve"> </w:t>
+            </w:r>
+            <w:proofErr w:type="spellStart"/>
+            <w:r>
+              <w:rPr>
+                <w:rFonts w:ascii="Times New Roman" w:hAnsi="Times New Roman"/>
+                <w:szCs w:val="24"/>
+                <w:lang w:val="fr-FR"/>
+              </w:rPr>
+              <w:t>phố</w:t>
+            </w:r>
+            <w:proofErr w:type="spellEnd"/>
+            <w:r>
+              <w:rPr>
+                <w:rFonts w:ascii="Times New Roman" w:hAnsi="Times New Roman"/>
+                <w:szCs w:val="24"/>
+                <w:lang w:val="fr-FR"/>
+              </w:rPr>
+              <w:t xml:space="preserve"> Hải </w:t>
+            </w:r>
+            <w:proofErr w:type="spellStart"/>
+            <w:r>
+              <w:rPr>
+                <w:rFonts w:ascii="Times New Roman" w:hAnsi="Times New Roman"/>
+                <w:szCs w:val="24"/>
+                <w:lang w:val="fr-FR"/>
+              </w:rPr>
+              <w:t>Phòng</w:t>
+            </w:r>
+            <w:proofErr w:type="spellEnd"/>
           </w:p>
           <w:p>
             <w:pPr>
@@ -2742,8 +3583,252 @@
                 <w:szCs w:val="24"/>
                 <w:lang w:val="fr-FR"/>
               </w:rPr>
-              <w:t>+ Các địa điểm khác theo sự phân công của Công ty theo yêu cầu công việc</w:t>
-            </w:r>
+              <w:t xml:space="preserve">+ Các </w:t>
+            </w:r>
+            <w:proofErr w:type="spellStart"/>
+            <w:r>
+              <w:rPr>
+                <w:rFonts w:ascii="Times New Roman" w:hAnsi="Times New Roman"/>
+                <w:szCs w:val="24"/>
+                <w:lang w:val="fr-FR"/>
+              </w:rPr>
+              <w:t>địa</w:t>
+            </w:r>
+            <w:proofErr w:type="spellEnd"/>
+            <w:r>
+              <w:rPr>
+                <w:rFonts w:ascii="Times New Roman" w:hAnsi="Times New Roman"/>
+                <w:szCs w:val="24"/>
+                <w:lang w:val="fr-FR"/>
+              </w:rPr>
+              <w:t xml:space="preserve"> </w:t>
+            </w:r>
+            <w:proofErr w:type="spellStart"/>
+            <w:r>
+              <w:rPr>
+                <w:rFonts w:ascii="Times New Roman" w:hAnsi="Times New Roman"/>
+                <w:szCs w:val="24"/>
+                <w:lang w:val="fr-FR"/>
+              </w:rPr>
+              <w:t>điểm</w:t>
+            </w:r>
+            <w:proofErr w:type="spellEnd"/>
+            <w:r>
+              <w:rPr>
+                <w:rFonts w:ascii="Times New Roman" w:hAnsi="Times New Roman"/>
+                <w:szCs w:val="24"/>
+                <w:lang w:val="fr-FR"/>
+              </w:rPr>
+              <w:t xml:space="preserve"> </w:t>
+            </w:r>
+            <w:proofErr w:type="spellStart"/>
+            <w:r>
+              <w:rPr>
+                <w:rFonts w:ascii="Times New Roman" w:hAnsi="Times New Roman"/>
+                <w:szCs w:val="24"/>
+                <w:lang w:val="fr-FR"/>
+              </w:rPr>
+              <w:t>khác</w:t>
+            </w:r>
+            <w:proofErr w:type="spellEnd"/>
+            <w:r>
+              <w:rPr>
+                <w:rFonts w:ascii="Times New Roman" w:hAnsi="Times New Roman"/>
+                <w:szCs w:val="24"/>
+                <w:lang w:val="fr-FR"/>
+              </w:rPr>
+              <w:t xml:space="preserve"> </w:t>
+            </w:r>
+            <w:proofErr w:type="spellStart"/>
+            <w:r>
+              <w:rPr>
+                <w:rFonts w:ascii="Times New Roman" w:hAnsi="Times New Roman"/>
+                <w:szCs w:val="24"/>
+                <w:lang w:val="fr-FR"/>
+              </w:rPr>
+              <w:t>theo</w:t>
+            </w:r>
+            <w:proofErr w:type="spellEnd"/>
+            <w:r>
+              <w:rPr>
+                <w:rFonts w:ascii="Times New Roman" w:hAnsi="Times New Roman"/>
+                <w:szCs w:val="24"/>
+                <w:lang w:val="fr-FR"/>
+              </w:rPr>
+              <w:t xml:space="preserve"> </w:t>
+            </w:r>
+            <w:proofErr w:type="spellStart"/>
+            <w:r>
+              <w:rPr>
+                <w:rFonts w:ascii="Times New Roman" w:hAnsi="Times New Roman"/>
+                <w:szCs w:val="24"/>
+                <w:lang w:val="fr-FR"/>
+              </w:rPr>
+              <w:t>sự</w:t>
+            </w:r>
+            <w:proofErr w:type="spellEnd"/>
+            <w:r>
+              <w:rPr>
+                <w:rFonts w:ascii="Times New Roman" w:hAnsi="Times New Roman"/>
+                <w:szCs w:val="24"/>
+                <w:lang w:val="fr-FR"/>
+              </w:rPr>
+              <w:t xml:space="preserve"> </w:t>
+            </w:r>
+            <w:proofErr w:type="spellStart"/>
+            <w:r>
+              <w:rPr>
+                <w:rFonts w:ascii="Times New Roman" w:hAnsi="Times New Roman"/>
+                <w:szCs w:val="24"/>
+                <w:lang w:val="fr-FR"/>
+              </w:rPr>
+              <w:t>phân</w:t>
+            </w:r>
+            <w:proofErr w:type="spellEnd"/>
+            <w:r>
+              <w:rPr>
+                <w:rFonts w:ascii="Times New Roman" w:hAnsi="Times New Roman"/>
+                <w:szCs w:val="24"/>
+                <w:lang w:val="fr-FR"/>
+              </w:rPr>
+              <w:t xml:space="preserve"> </w:t>
+            </w:r>
+            <w:proofErr w:type="spellStart"/>
+            <w:r>
+              <w:rPr>
+                <w:rFonts w:ascii="Times New Roman" w:hAnsi="Times New Roman"/>
+                <w:szCs w:val="24"/>
+                <w:lang w:val="fr-FR"/>
+              </w:rPr>
+              <w:t>công</w:t>
+            </w:r>
+            <w:proofErr w:type="spellEnd"/>
+            <w:r>
+              <w:rPr>
+                <w:rFonts w:ascii="Times New Roman" w:hAnsi="Times New Roman"/>
+                <w:szCs w:val="24"/>
+                <w:lang w:val="fr-FR"/>
+              </w:rPr>
+              <w:t xml:space="preserve"> </w:t>
+            </w:r>
+            <w:proofErr w:type="spellStart"/>
+            <w:r>
+              <w:rPr>
+                <w:rFonts w:ascii="Times New Roman" w:hAnsi="Times New Roman"/>
+                <w:szCs w:val="24"/>
+                <w:lang w:val="fr-FR"/>
+              </w:rPr>
+              <w:t>của</w:t>
+            </w:r>
+            <w:proofErr w:type="spellEnd"/>
+            <w:r>
+              <w:rPr>
+                <w:rFonts w:ascii="Times New Roman" w:hAnsi="Times New Roman"/>
+                <w:szCs w:val="24"/>
+                <w:lang w:val="fr-FR"/>
+              </w:rPr>
+              <w:t xml:space="preserve"> Công </w:t>
+            </w:r>
+            <w:proofErr w:type="spellStart"/>
+            <w:r>
+              <w:rPr>
+                <w:rFonts w:ascii="Times New Roman" w:hAnsi="Times New Roman"/>
+                <w:szCs w:val="24"/>
+                <w:lang w:val="fr-FR"/>
+              </w:rPr>
+              <w:t>ty</w:t>
+            </w:r>
+            <w:proofErr w:type="spellEnd"/>
+            <w:r>
+              <w:rPr>
+                <w:rFonts w:ascii="Times New Roman" w:hAnsi="Times New Roman"/>
+                <w:szCs w:val="24"/>
+                <w:lang w:val="fr-FR"/>
+              </w:rPr>
+              <w:t xml:space="preserve"> </w:t>
+            </w:r>
+            <w:proofErr w:type="spellStart"/>
+            <w:r>
+              <w:rPr>
+                <w:rFonts w:ascii="Times New Roman" w:hAnsi="Times New Roman"/>
+                <w:szCs w:val="24"/>
+                <w:lang w:val="fr-FR"/>
+              </w:rPr>
+              <w:t>theo</w:t>
+            </w:r>
+            <w:proofErr w:type="spellEnd"/>
+            <w:r>
+              <w:rPr>
+                <w:rFonts w:ascii="Times New Roman" w:hAnsi="Times New Roman"/>
+                <w:szCs w:val="24"/>
+                <w:lang w:val="fr-FR"/>
+              </w:rPr>
+              <w:t xml:space="preserve"> </w:t>
+            </w:r>
+            <w:proofErr w:type="spellStart"/>
+            <w:r>
+              <w:rPr>
+                <w:rFonts w:ascii="Times New Roman" w:hAnsi="Times New Roman"/>
+                <w:szCs w:val="24"/>
+                <w:lang w:val="fr-FR"/>
+              </w:rPr>
+              <w:t>yêu</w:t>
+            </w:r>
+            <w:proofErr w:type="spellEnd"/>
+            <w:r>
+              <w:rPr>
+                <w:rFonts w:ascii="Times New Roman" w:hAnsi="Times New Roman"/>
+                <w:szCs w:val="24"/>
+                <w:lang w:val="fr-FR"/>
+              </w:rPr>
+              <w:t xml:space="preserve"> </w:t>
+            </w:r>
+            <w:proofErr w:type="spellStart"/>
+            <w:r>
+              <w:rPr>
+                <w:rFonts w:ascii="Times New Roman" w:hAnsi="Times New Roman"/>
+                <w:szCs w:val="24"/>
+                <w:lang w:val="fr-FR"/>
+              </w:rPr>
+              <w:t>cầu</w:t>
+            </w:r>
+            <w:proofErr w:type="spellEnd"/>
+            <w:r>
+              <w:rPr>
+                <w:rFonts w:ascii="Times New Roman" w:hAnsi="Times New Roman"/>
+                <w:szCs w:val="24"/>
+                <w:lang w:val="fr-FR"/>
+              </w:rPr>
+              <w:t xml:space="preserve"> </w:t>
+            </w:r>
+            <w:proofErr w:type="spellStart"/>
+            <w:r>
+              <w:rPr>
+                <w:rFonts w:ascii="Times New Roman" w:hAnsi="Times New Roman"/>
+                <w:szCs w:val="24"/>
+                <w:lang w:val="fr-FR"/>
+              </w:rPr>
+              <w:t>công</w:t>
+            </w:r>
+            <w:proofErr w:type="spellEnd"/>
+            <w:r>
+              <w:rPr>
+                <w:rFonts w:ascii="Times New Roman" w:hAnsi="Times New Roman"/>
+                <w:szCs w:val="24"/>
+                <w:lang w:val="fr-FR"/>
+              </w:rPr>
+              <w:t xml:space="preserve"> </w:t>
+            </w:r>
+            <w:proofErr w:type="spellStart"/>
+            <w:r>
+              <w:rPr>
+                <w:rFonts w:ascii="Times New Roman" w:hAnsi="Times New Roman"/>
+                <w:szCs w:val="24"/>
+                <w:lang w:val="fr-FR"/>
+              </w:rPr>
+              <w:t>việc</w:t>
+            </w:r>
+            <w:proofErr w:type="spellEnd"/>
           </w:p>
         </w:tc>
       </w:tr>
@@ -2848,7 +3933,25 @@
                 <w:szCs w:val="24"/>
                 <w:lang w:val="fr-FR"/>
               </w:rPr>
-              <w:t>{{chucdanh}}</w:t>
+              <w:t>{{</w:t>
+            </w:r>
+            <w:proofErr w:type="spellStart"/>
+            <w:r>
+              <w:rPr>
+                <w:color w:val="000000"/>
+                <w:szCs w:val="24"/>
+                <w:lang w:val="fr-FR"/>
+              </w:rPr>
+              <w:t>chucdanh</w:t>
+            </w:r>
+            <w:proofErr w:type="spellEnd"/>
+            <w:r>
+              <w:rPr>
+                <w:color w:val="000000"/>
+                <w:szCs w:val="24"/>
+                <w:lang w:val="fr-FR"/>
+              </w:rPr>
+              <w:t>}}</w:t>
             </w:r>
           </w:p>
           <w:p>
@@ -2969,6 +4072,7 @@
               </w:rPr>
               <w:t>{{</w:t>
             </w:r>
+            <w:proofErr w:type="spellStart"/>
             <w:r>
               <w:rPr>
                 <w:b/>
@@ -2978,6 +4082,7 @@
               </w:rPr>
               <w:t>bophan</w:t>
             </w:r>
+            <w:proofErr w:type="spellEnd"/>
             <w:r>
               <w:rPr>
                 <w:b/>
@@ -3180,6 +4285,7 @@
                 <w:lang w:val="fr-FR"/>
               </w:rPr>
             </w:pPr>
+            <w:proofErr w:type="spellStart"/>
             <w:r>
               <w:rPr>
                 <w:rFonts w:ascii="Times New Roman" w:hAnsi="Times New Roman"/>
@@ -3187,7 +4293,407 @@
                 <w:szCs w:val="24"/>
                 <w:lang w:val="fr-FR"/>
               </w:rPr>
-              <w:t>Thực hiện theo bảng mô tả công việc và các công việc liên quan khác dưới sự phân công của ng</w:t>
+              <w:t>Thực</w:t>
+            </w:r>
+            <w:proofErr w:type="spellEnd"/>
+            <w:r>
+              <w:rPr>
+                <w:rFonts w:ascii="Times New Roman" w:hAnsi="Times New Roman"/>
+                <w:color w:val="000000"/>
+                <w:szCs w:val="24"/>
+                <w:lang w:val="fr-FR"/>
+              </w:rPr>
+              <w:t xml:space="preserve"> </w:t>
+            </w:r>
+            <w:proofErr w:type="spellStart"/>
+            <w:r>
+              <w:rPr>
+                <w:rFonts w:ascii="Times New Roman" w:hAnsi="Times New Roman"/>
+                <w:color w:val="000000"/>
+                <w:szCs w:val="24"/>
+                <w:lang w:val="fr-FR"/>
+              </w:rPr>
+              <w:t>hiện</w:t>
+            </w:r>
+            <w:proofErr w:type="spellEnd"/>
+            <w:r>
+              <w:rPr>
+                <w:rFonts w:ascii="Times New Roman" w:hAnsi="Times New Roman"/>
+                <w:color w:val="000000"/>
+                <w:szCs w:val="24"/>
+                <w:lang w:val="fr-FR"/>
+              </w:rPr>
+              <w:t xml:space="preserve"> </w:t>
+            </w:r>
+            <w:proofErr w:type="spellStart"/>
+            <w:r>
+              <w:rPr>
+                <w:rFonts w:ascii="Times New Roman" w:hAnsi="Times New Roman"/>
+                <w:color w:val="000000"/>
+                <w:szCs w:val="24"/>
+                <w:lang w:val="fr-FR"/>
+              </w:rPr>
+              <w:t>theo</w:t>
+            </w:r>
+            <w:proofErr w:type="spellEnd"/>
+            <w:r>
+              <w:rPr>
+                <w:rFonts w:ascii="Times New Roman" w:hAnsi="Times New Roman"/>
+                <w:color w:val="000000"/>
+                <w:szCs w:val="24"/>
+                <w:lang w:val="fr-FR"/>
+              </w:rPr>
+              <w:t xml:space="preserve"> </w:t>
+            </w:r>
+            <w:proofErr w:type="spellStart"/>
+            <w:r>
+              <w:rPr>
+                <w:rFonts w:ascii="Times New Roman" w:hAnsi="Times New Roman"/>
+                <w:color w:val="000000"/>
+                <w:szCs w:val="24"/>
+                <w:lang w:val="fr-FR"/>
+              </w:rPr>
+              <w:t>bảng</w:t>
+            </w:r>
+            <w:proofErr w:type="spellEnd"/>
+            <w:r>
+              <w:rPr>
+                <w:rFonts w:ascii="Times New Roman" w:hAnsi="Times New Roman"/>
+                <w:color w:val="000000"/>
+                <w:szCs w:val="24"/>
+                <w:lang w:val="fr-FR"/>
+              </w:rPr>
+              <w:t xml:space="preserve"> </w:t>
+            </w:r>
+            <w:proofErr w:type="spellStart"/>
+            <w:r>
+              <w:rPr>
+                <w:rFonts w:ascii="Times New Roman" w:hAnsi="Times New Roman"/>
+                <w:color w:val="000000"/>
+                <w:szCs w:val="24"/>
+                <w:lang w:val="fr-FR"/>
+              </w:rPr>
+              <w:t>mô</w:t>
+            </w:r>
+            <w:proofErr w:type="spellEnd"/>
+            <w:r>
+              <w:rPr>
+                <w:rFonts w:ascii="Times New Roman" w:hAnsi="Times New Roman"/>
+                <w:color w:val="000000"/>
+                <w:szCs w:val="24"/>
+                <w:lang w:val="fr-FR"/>
+              </w:rPr>
+              <w:t xml:space="preserve"> </w:t>
+            </w:r>
+            <w:proofErr w:type="spellStart"/>
+            <w:r>
+              <w:rPr>
+                <w:rFonts w:ascii="Times New Roman" w:hAnsi="Times New Roman"/>
+                <w:color w:val="000000"/>
+                <w:szCs w:val="24"/>
+                <w:lang w:val="fr-FR"/>
+              </w:rPr>
+              <w:t>tả</w:t>
+            </w:r>
+            <w:proofErr w:type="spellEnd"/>
+            <w:r>
+              <w:rPr>
+                <w:rFonts w:ascii="Times New Roman" w:hAnsi="Times New Roman"/>
+                <w:color w:val="000000"/>
+                <w:szCs w:val="24"/>
+                <w:lang w:val="fr-FR"/>
+              </w:rPr>
+              <w:t xml:space="preserve"> </w:t>
+            </w:r>
+            <w:proofErr w:type="spellStart"/>
+            <w:r>
+              <w:rPr>
+                <w:rFonts w:ascii="Times New Roman" w:hAnsi="Times New Roman"/>
+                <w:color w:val="000000"/>
+                <w:szCs w:val="24"/>
+                <w:lang w:val="fr-FR"/>
+              </w:rPr>
+              <w:t>công</w:t>
+            </w:r>
+            <w:proofErr w:type="spellEnd"/>
+            <w:r>
+              <w:rPr>
+                <w:rFonts w:ascii="Times New Roman" w:hAnsi="Times New Roman"/>
+                <w:color w:val="000000"/>
+                <w:szCs w:val="24"/>
+                <w:lang w:val="fr-FR"/>
+              </w:rPr>
+              <w:t xml:space="preserve"> </w:t>
+            </w:r>
+            <w:proofErr w:type="spellStart"/>
+            <w:r>
+              <w:rPr>
+                <w:rFonts w:ascii="Times New Roman" w:hAnsi="Times New Roman"/>
+                <w:color w:val="000000"/>
+                <w:szCs w:val="24"/>
+                <w:lang w:val="fr-FR"/>
+              </w:rPr>
+              <w:t>việc</w:t>
+            </w:r>
+            <w:proofErr w:type="spellEnd"/>
+            <w:r>
+              <w:rPr>
+                <w:rFonts w:ascii="Times New Roman" w:hAnsi="Times New Roman"/>
+                <w:color w:val="000000"/>
+                <w:szCs w:val="24"/>
+                <w:lang w:val="fr-FR"/>
+              </w:rPr>
+              <w:t xml:space="preserve"> </w:t>
+            </w:r>
+            <w:proofErr w:type="spellStart"/>
+            <w:r>
+              <w:rPr>
+                <w:rFonts w:ascii="Times New Roman" w:hAnsi="Times New Roman"/>
+                <w:color w:val="000000"/>
+                <w:szCs w:val="24"/>
+                <w:lang w:val="fr-FR"/>
+              </w:rPr>
+              <w:t>và</w:t>
+            </w:r>
+            <w:proofErr w:type="spellEnd"/>
+            <w:r>
+              <w:rPr>
+                <w:rFonts w:ascii="Times New Roman" w:hAnsi="Times New Roman"/>
+                <w:color w:val="000000"/>
+                <w:szCs w:val="24"/>
+                <w:lang w:val="fr-FR"/>
+              </w:rPr>
+              <w:t xml:space="preserve"> </w:t>
+            </w:r>
+            <w:proofErr w:type="spellStart"/>
+            <w:r>
+              <w:rPr>
+                <w:rFonts w:ascii="Times New Roman" w:hAnsi="Times New Roman"/>
+                <w:color w:val="000000"/>
+                <w:szCs w:val="24"/>
+                <w:lang w:val="fr-FR"/>
+              </w:rPr>
+              <w:t>các</w:t>
+            </w:r>
+            <w:proofErr w:type="spellEnd"/>
+            <w:r>
+              <w:rPr>
+                <w:rFonts w:ascii="Times New Roman" w:hAnsi="Times New Roman"/>
+                <w:color w:val="000000"/>
+                <w:szCs w:val="24"/>
+                <w:lang w:val="fr-FR"/>
+              </w:rPr>
+              <w:t xml:space="preserve"> </w:t>
+            </w:r>
+            <w:proofErr w:type="spellStart"/>
+            <w:r>
+              <w:rPr>
+                <w:rFonts w:ascii="Times New Roman" w:hAnsi="Times New Roman"/>
+                <w:color w:val="000000"/>
+                <w:szCs w:val="24"/>
+                <w:lang w:val="fr-FR"/>
+              </w:rPr>
+              <w:t>công</w:t>
+            </w:r>
+            <w:proofErr w:type="spellEnd"/>
+            <w:r>
+              <w:rPr>
+                <w:rFonts w:ascii="Times New Roman" w:hAnsi="Times New Roman"/>
+                <w:color w:val="000000"/>
+                <w:szCs w:val="24"/>
+                <w:lang w:val="fr-FR"/>
+              </w:rPr>
+              <w:t xml:space="preserve"> </w:t>
+            </w:r>
+            <w:proofErr w:type="spellStart"/>
+            <w:r>
+              <w:rPr>
+                <w:rFonts w:ascii="Times New Roman" w:hAnsi="Times New Roman"/>
+                <w:color w:val="000000"/>
+                <w:szCs w:val="24"/>
+                <w:lang w:val="fr-FR"/>
+              </w:rPr>
+              <w:t>việc</w:t>
+            </w:r>
+            <w:proofErr w:type="spellEnd"/>
+            <w:r>
+              <w:rPr>
+                <w:rFonts w:ascii="Times New Roman" w:hAnsi="Times New Roman"/>
+                <w:color w:val="000000"/>
+                <w:szCs w:val="24"/>
+                <w:lang w:val="fr-FR"/>
+              </w:rPr>
+              <w:t xml:space="preserve"> </w:t>
+            </w:r>
+            <w:proofErr w:type="spellStart"/>
+            <w:r>
+              <w:rPr>
+                <w:rFonts w:ascii="Times New Roman" w:hAnsi="Times New Roman"/>
+                <w:color w:val="000000"/>
+                <w:szCs w:val="24"/>
+                <w:lang w:val="fr-FR"/>
+              </w:rPr>
+              <w:t>liên</w:t>
+            </w:r>
+            <w:proofErr w:type="spellEnd"/>
+            <w:r>
+              <w:rPr>
+                <w:rFonts w:ascii="Times New Roman" w:hAnsi="Times New Roman"/>
+                <w:color w:val="000000"/>
+                <w:szCs w:val="24"/>
+                <w:lang w:val="fr-FR"/>
+              </w:rPr>
+              <w:t xml:space="preserve"> </w:t>
+            </w:r>
+            <w:proofErr w:type="spellStart"/>
+            <w:r>
+              <w:rPr>
+                <w:rFonts w:ascii="Times New Roman" w:hAnsi="Times New Roman"/>
+                <w:color w:val="000000"/>
+                <w:szCs w:val="24"/>
+                <w:lang w:val="fr-FR"/>
+              </w:rPr>
+              <w:t>quan</w:t>
+            </w:r>
+            <w:proofErr w:type="spellEnd"/>
+            <w:r>
+              <w:rPr>
+                <w:rFonts w:ascii="Times New Roman" w:hAnsi="Times New Roman"/>
+                <w:color w:val="000000"/>
+                <w:szCs w:val="24"/>
+                <w:lang w:val="fr-FR"/>
+              </w:rPr>
+              <w:t xml:space="preserve"> </w:t>
+            </w:r>
+            <w:proofErr w:type="spellStart"/>
+            <w:r>
+              <w:rPr>
+                <w:rFonts w:ascii="Times New Roman" w:hAnsi="Times New Roman"/>
+                <w:color w:val="000000"/>
+                <w:szCs w:val="24"/>
+                <w:lang w:val="fr-FR"/>
+              </w:rPr>
+              <w:t>khác</w:t>
+            </w:r>
+            <w:proofErr w:type="spellEnd"/>
+            <w:r>
+              <w:rPr>
+                <w:rFonts w:ascii="Times New Roman" w:hAnsi="Times New Roman"/>
+                <w:color w:val="000000"/>
+                <w:szCs w:val="24"/>
+                <w:lang w:val="fr-FR"/>
+              </w:rPr>
+              <w:t xml:space="preserve"> </w:t>
+            </w:r>
+            <w:proofErr w:type="spellStart"/>
+            <w:r>
+              <w:rPr>
+                <w:rFonts w:ascii="Times New Roman" w:hAnsi="Times New Roman"/>
+                <w:color w:val="000000"/>
+                <w:szCs w:val="24"/>
+                <w:lang w:val="fr-FR"/>
+              </w:rPr>
+              <w:t>dưới</w:t>
+            </w:r>
+            <w:proofErr w:type="spellEnd"/>
+            <w:r>
+              <w:rPr>
+                <w:rFonts w:ascii="Times New Roman" w:hAnsi="Times New Roman"/>
+                <w:color w:val="000000"/>
+                <w:szCs w:val="24"/>
+                <w:lang w:val="fr-FR"/>
+              </w:rPr>
+              <w:t xml:space="preserve"> </w:t>
+            </w:r>
+            <w:proofErr w:type="spellStart"/>
+            <w:r>
+              <w:rPr>
+                <w:rFonts w:ascii="Times New Roman" w:hAnsi="Times New Roman"/>
+                <w:color w:val="000000"/>
+                <w:szCs w:val="24"/>
+                <w:lang w:val="fr-FR"/>
+              </w:rPr>
+              <w:t>sự</w:t>
+            </w:r>
+            <w:proofErr w:type="spellEnd"/>
+            <w:r>
+              <w:rPr>
+                <w:rFonts w:ascii="Times New Roman" w:hAnsi="Times New Roman"/>
+                <w:color w:val="000000"/>
+                <w:szCs w:val="24"/>
+                <w:lang w:val="fr-FR"/>
+              </w:rPr>
+              <w:t xml:space="preserve"> </w:t>
+            </w:r>
+            <w:proofErr w:type="spellStart"/>
+            <w:r>
+              <w:rPr>
+                <w:rFonts w:ascii="Times New Roman" w:hAnsi="Times New Roman"/>
+                <w:color w:val="000000"/>
+                <w:szCs w:val="24"/>
+                <w:lang w:val="fr-FR"/>
+              </w:rPr>
+              <w:t>phân</w:t>
+            </w:r>
+            <w:proofErr w:type="spellEnd"/>
+            <w:r>
+              <w:rPr>
+                <w:rFonts w:ascii="Times New Roman" w:hAnsi="Times New Roman"/>
+                <w:color w:val="000000"/>
+                <w:szCs w:val="24"/>
+                <w:lang w:val="fr-FR"/>
+              </w:rPr>
+              <w:t xml:space="preserve"> </w:t>
+            </w:r>
+            <w:proofErr w:type="spellStart"/>
+            <w:r>
+              <w:rPr>
+                <w:rFonts w:ascii="Times New Roman" w:hAnsi="Times New Roman"/>
+                <w:color w:val="000000"/>
+                <w:szCs w:val="24"/>
+                <w:lang w:val="fr-FR"/>
+              </w:rPr>
+              <w:t>công</w:t>
+            </w:r>
+            <w:proofErr w:type="spellEnd"/>
+            <w:r>
+              <w:rPr>
+                <w:rFonts w:ascii="Times New Roman" w:hAnsi="Times New Roman"/>
+                <w:color w:val="000000"/>
+                <w:szCs w:val="24"/>
+                <w:lang w:val="fr-FR"/>
+              </w:rPr>
+              <w:t xml:space="preserve"> </w:t>
+            </w:r>
+            <w:proofErr w:type="spellStart"/>
+            <w:r>
+              <w:rPr>
+                <w:rFonts w:ascii="Times New Roman" w:hAnsi="Times New Roman"/>
+                <w:color w:val="000000"/>
+                <w:szCs w:val="24"/>
+                <w:lang w:val="fr-FR"/>
+              </w:rPr>
+              <w:t>của</w:t>
+            </w:r>
+            <w:proofErr w:type="spellEnd"/>
+            <w:r>
+              <w:rPr>
+                <w:rFonts w:ascii="Times New Roman" w:hAnsi="Times New Roman"/>
+                <w:color w:val="000000"/>
+                <w:szCs w:val="24"/>
+                <w:lang w:val="fr-FR"/>
+              </w:rPr>
+              <w:t xml:space="preserve"> </w:t>
+            </w:r>
+            <w:proofErr w:type="spellStart"/>
+            <w:r>
+              <w:rPr>
+                <w:rFonts w:ascii="Times New Roman" w:hAnsi="Times New Roman"/>
+                <w:color w:val="000000"/>
+                <w:szCs w:val="24"/>
+                <w:lang w:val="fr-FR"/>
+              </w:rPr>
+              <w:t>ng</w:t>
             </w:r>
             <w:r>
               <w:rPr>
@@ -3205,7 +4711,97 @@
                 <w:szCs w:val="24"/>
                 <w:lang w:val="fr-FR"/>
               </w:rPr>
-              <w:t>ời quản lý trực tiếp.</w:t>
+              <w:t>ời</w:t>
+            </w:r>
+            <w:proofErr w:type="spellEnd"/>
+            <w:r>
+              <w:rPr>
+                <w:rFonts w:ascii="Times New Roman" w:hAnsi="Times New Roman"/>
+                <w:color w:val="000000"/>
+                <w:szCs w:val="24"/>
+                <w:lang w:val="fr-FR"/>
+              </w:rPr>
+              <w:t xml:space="preserve"> </w:t>
+            </w:r>
+            <w:proofErr w:type="spellStart"/>
+            <w:r>
+              <w:rPr>
+                <w:rFonts w:ascii="Times New Roman" w:hAnsi="Times New Roman"/>
+                <w:color w:val="000000"/>
+                <w:szCs w:val="24"/>
+                <w:lang w:val="fr-FR"/>
+              </w:rPr>
+              <w:t>quản</w:t>
+            </w:r>
+            <w:proofErr w:type="spellEnd"/>
+            <w:r>
+              <w:rPr>
+                <w:rFonts w:ascii="Times New Roman" w:hAnsi="Times New Roman"/>
+                <w:color w:val="000000"/>
+                <w:szCs w:val="24"/>
+                <w:lang w:val="fr-FR"/>
+              </w:rPr>
+              <w:t xml:space="preserve"> </w:t>
+            </w:r>
+            <w:proofErr w:type="spellStart"/>
+            <w:r>
+              <w:rPr>
+                <w:rFonts w:ascii="Times New Roman" w:hAnsi="Times New Roman"/>
+                <w:color w:val="000000"/>
+                <w:szCs w:val="24"/>
+                <w:lang w:val="fr-FR"/>
+              </w:rPr>
+              <w:t>lý</w:t>
+            </w:r>
+            <w:proofErr w:type="spellEnd"/>
+            <w:r>
+              <w:rPr>
+                <w:rFonts w:ascii="Times New Roman" w:hAnsi="Times New Roman"/>
+                <w:color w:val="000000"/>
+                <w:szCs w:val="24"/>
+                <w:lang w:val="fr-FR"/>
+              </w:rPr>
+              <w:t xml:space="preserve"> </w:t>
+            </w:r>
+            <w:proofErr w:type="spellStart"/>
+            <w:r>
+              <w:rPr>
+                <w:rFonts w:ascii="Times New Roman" w:hAnsi="Times New Roman"/>
+                <w:color w:val="000000"/>
+                <w:szCs w:val="24"/>
+                <w:lang w:val="fr-FR"/>
+              </w:rPr>
+              <w:t>trực</w:t>
+            </w:r>
+            <w:proofErr w:type="spellEnd"/>
+            <w:r>
+              <w:rPr>
+                <w:rFonts w:ascii="Times New Roman" w:hAnsi="Times New Roman"/>
+                <w:color w:val="000000"/>
+                <w:szCs w:val="24"/>
+                <w:lang w:val="fr-FR"/>
+              </w:rPr>
+              <w:t xml:space="preserve"> </w:t>
+            </w:r>
+            <w:proofErr w:type="spellStart"/>
+            <w:r>
+              <w:rPr>
+                <w:rFonts w:ascii="Times New Roman" w:hAnsi="Times New Roman"/>
+                <w:color w:val="000000"/>
+                <w:szCs w:val="24"/>
+                <w:lang w:val="fr-FR"/>
+              </w:rPr>
+              <w:t>tiếp</w:t>
+            </w:r>
+            <w:proofErr w:type="spellEnd"/>
+            <w:r>
+              <w:rPr>
+                <w:rFonts w:ascii="Times New Roman" w:hAnsi="Times New Roman"/>
+                <w:color w:val="000000"/>
+                <w:szCs w:val="24"/>
+                <w:lang w:val="fr-FR"/>
+              </w:rPr>
+              <w:t>.</w:t>
             </w:r>
           </w:p>
         </w:tc>
@@ -3233,8 +4829,21 @@
           <w:u w:val="single"/>
           <w:lang w:val="fr-FR"/>
         </w:rPr>
-        <w:t>ĐIỀU 2:</w:t>
-      </w:r>
+        <w:t xml:space="preserve">ĐIỀU </w:t>
+      </w:r>
+      <w:proofErr w:type="gramStart"/>
+      <w:r>
+        <w:rPr>
+          <w:rFonts w:ascii="Times New Roman" w:hAnsi="Times New Roman"/>
+          <w:b/>
+          <w:bCs/>
+          <w:szCs w:val="24"/>
+          <w:u w:val="single"/>
+          <w:lang w:val="fr-FR"/>
+        </w:rPr>
+        <w:t>2:</w:t>
+      </w:r>
+      <w:proofErr w:type="gramEnd"/>
       <w:r>
         <w:rPr>
           <w:rFonts w:ascii="Times New Roman" w:hAnsi="Times New Roman"/>
@@ -3272,6 +4881,7 @@
           <w:lang w:val="fr-FR"/>
         </w:rPr>
       </w:pPr>
+      <w:proofErr w:type="spellStart"/>
       <w:r>
         <w:rPr>
           <w:rFonts w:ascii="Times New Roman" w:hAnsi="Times New Roman"/>
@@ -3294,14 +4904,50 @@
           <w:szCs w:val="24"/>
           <w:lang w:val="fr-FR"/>
         </w:rPr>
-        <w:t>i gian l</w:t>
-      </w:r>
-      <w:r>
-        <w:rPr>
-          <w:rFonts w:ascii="Times New Roman" w:hAnsi="Times New Roman" w:cs="Calibri"/>
+        <w:t>i</w:t>
+      </w:r>
+      <w:proofErr w:type="spellEnd"/>
+      <w:r>
+        <w:rPr>
+          <w:rFonts w:ascii="Times New Roman" w:hAnsi="Times New Roman"/>
           <w:szCs w:val="24"/>
           <w:lang w:val="fr-FR"/>
         </w:rPr>
+        <w:t xml:space="preserve"> </w:t>
+      </w:r>
+      <w:proofErr w:type="spellStart"/>
+      <w:r>
+        <w:rPr>
+          <w:rFonts w:ascii="Times New Roman" w:hAnsi="Times New Roman"/>
+          <w:szCs w:val="24"/>
+          <w:lang w:val="fr-FR"/>
+        </w:rPr>
+        <w:t>gian</w:t>
+      </w:r>
+      <w:proofErr w:type="spellEnd"/>
+      <w:r>
+        <w:rPr>
+          <w:rFonts w:ascii="Times New Roman" w:hAnsi="Times New Roman"/>
+          <w:szCs w:val="24"/>
+          <w:lang w:val="fr-FR"/>
+        </w:rPr>
+        <w:t xml:space="preserve"> </w:t>
+      </w:r>
+      <w:proofErr w:type="spellStart"/>
+      <w:r>
+        <w:rPr>
+          <w:rFonts w:ascii="Times New Roman" w:hAnsi="Times New Roman"/>
+          <w:szCs w:val="24"/>
+          <w:lang w:val="fr-FR"/>
+        </w:rPr>
+        <w:t>l</w:t>
+      </w:r>
+      <w:r>
+        <w:rPr>
+          <w:rFonts w:ascii="Times New Roman" w:hAnsi="Times New Roman" w:cs="Calibri"/>
+          <w:szCs w:val="24"/>
+          <w:lang w:val="fr-FR"/>
+        </w:rPr>
         <w:t>à</w:t>
       </w:r>
       <w:r>
@@ -3310,14 +4956,32 @@
           <w:szCs w:val="24"/>
           <w:lang w:val="fr-FR"/>
         </w:rPr>
-        <w:t>m vi</w:t>
-      </w:r>
-      <w:r>
-        <w:rPr>
-          <w:rFonts w:ascii="Times New Roman" w:hAnsi="Times New Roman" w:cs="Calibri"/>
+        <w:t>m</w:t>
+      </w:r>
+      <w:proofErr w:type="spellEnd"/>
+      <w:r>
+        <w:rPr>
+          <w:rFonts w:ascii="Times New Roman" w:hAnsi="Times New Roman"/>
           <w:szCs w:val="24"/>
           <w:lang w:val="fr-FR"/>
         </w:rPr>
+        <w:t xml:space="preserve"> </w:t>
+      </w:r>
+      <w:proofErr w:type="spellStart"/>
+      <w:r>
+        <w:rPr>
+          <w:rFonts w:ascii="Times New Roman" w:hAnsi="Times New Roman"/>
+          <w:szCs w:val="24"/>
+          <w:lang w:val="fr-FR"/>
+        </w:rPr>
+        <w:t>vi</w:t>
+      </w:r>
+      <w:r>
+        <w:rPr>
+          <w:rFonts w:ascii="Times New Roman" w:hAnsi="Times New Roman" w:cs="Calibri"/>
+          <w:szCs w:val="24"/>
+          <w:lang w:val="fr-FR"/>
+        </w:rPr>
         <w:t>ệ</w:t>
       </w:r>
       <w:r>
@@ -3326,14 +4990,32 @@
           <w:szCs w:val="24"/>
           <w:lang w:val="fr-FR"/>
         </w:rPr>
-        <w:t>c, l</w:t>
-      </w:r>
-      <w:r>
-        <w:rPr>
-          <w:rFonts w:ascii="Times New Roman" w:hAnsi="Times New Roman" w:cs="Calibri"/>
+        <w:t>c</w:t>
+      </w:r>
+      <w:proofErr w:type="spellEnd"/>
+      <w:r>
+        <w:rPr>
+          <w:rFonts w:ascii="Times New Roman" w:hAnsi="Times New Roman"/>
           <w:szCs w:val="24"/>
           <w:lang w:val="fr-FR"/>
         </w:rPr>
+        <w:t xml:space="preserve">, </w:t>
+      </w:r>
+      <w:proofErr w:type="spellStart"/>
+      <w:r>
+        <w:rPr>
+          <w:rFonts w:ascii="Times New Roman" w:hAnsi="Times New Roman"/>
+          <w:szCs w:val="24"/>
+          <w:lang w:val="fr-FR"/>
+        </w:rPr>
+        <w:t>l</w:t>
+      </w:r>
+      <w:r>
+        <w:rPr>
+          <w:rFonts w:ascii="Times New Roman" w:hAnsi="Times New Roman" w:cs="Calibri"/>
+          <w:szCs w:val="24"/>
+          <w:lang w:val="fr-FR"/>
+        </w:rPr>
         <w:t>à</w:t>
       </w:r>
       <w:r>
@@ -3342,7 +5024,25 @@
           <w:szCs w:val="24"/>
           <w:lang w:val="fr-FR"/>
         </w:rPr>
-        <w:t>m th</w:t>
+        <w:t>m</w:t>
+      </w:r>
+      <w:proofErr w:type="spellEnd"/>
+      <w:r>
+        <w:rPr>
+          <w:rFonts w:ascii="Times New Roman" w:hAnsi="Times New Roman"/>
+          <w:szCs w:val="24"/>
+          <w:lang w:val="fr-FR"/>
+        </w:rPr>
+        <w:t xml:space="preserve"> </w:t>
+      </w:r>
+      <w:proofErr w:type="spellStart"/>
+      <w:r>
+        <w:rPr>
+          <w:rFonts w:ascii="Times New Roman" w:hAnsi="Times New Roman"/>
+          <w:szCs w:val="24"/>
+          <w:lang w:val="fr-FR"/>
+        </w:rPr>
+        <w:t>th</w:t>
       </w:r>
       <w:r>
         <w:rPr>
@@ -3358,46 +5058,84 @@
           <w:szCs w:val="24"/>
           <w:lang w:val="fr-FR"/>
         </w:rPr>
-        <w:t>m gi</w:t>
-      </w:r>
-      <w:r>
-        <w:rPr>
-          <w:rFonts w:ascii="Times New Roman" w:hAnsi="Times New Roman" w:cs="Calibri"/>
+        <w:t>m</w:t>
+      </w:r>
+      <w:proofErr w:type="spellEnd"/>
+      <w:r>
+        <w:rPr>
+          <w:rFonts w:ascii="Times New Roman" w:hAnsi="Times New Roman"/>
           <w:szCs w:val="24"/>
           <w:lang w:val="fr-FR"/>
         </w:rPr>
+        <w:t xml:space="preserve"> </w:t>
+      </w:r>
+      <w:proofErr w:type="spellStart"/>
+      <w:r>
+        <w:rPr>
+          <w:rFonts w:ascii="Times New Roman" w:hAnsi="Times New Roman"/>
+          <w:szCs w:val="24"/>
+          <w:lang w:val="fr-FR"/>
+        </w:rPr>
+        <w:t>gi</w:t>
+      </w:r>
+      <w:r>
+        <w:rPr>
+          <w:rFonts w:ascii="Times New Roman" w:hAnsi="Times New Roman" w:cs="Calibri"/>
+          <w:szCs w:val="24"/>
+          <w:lang w:val="fr-FR"/>
+        </w:rPr>
         <w:t>ờ</w:t>
       </w:r>
+      <w:proofErr w:type="spellEnd"/>
       <w:r>
         <w:rPr>
           <w:rFonts w:ascii="Times New Roman" w:hAnsi="Times New Roman"/>
           <w:szCs w:val="24"/>
           <w:lang w:val="fr-FR"/>
         </w:rPr>
-        <w:t xml:space="preserve"> v</w:t>
-      </w:r>
-      <w:r>
-        <w:rPr>
-          <w:rFonts w:ascii="Times New Roman" w:hAnsi="Times New Roman" w:cs="Calibri"/>
+        <w:t xml:space="preserve"> </w:t>
+      </w:r>
+      <w:proofErr w:type="spellStart"/>
+      <w:r>
+        <w:rPr>
+          <w:rFonts w:ascii="Times New Roman" w:hAnsi="Times New Roman"/>
           <w:szCs w:val="24"/>
           <w:lang w:val="fr-FR"/>
         </w:rPr>
+        <w:t>v</w:t>
+      </w:r>
+      <w:r>
+        <w:rPr>
+          <w:rFonts w:ascii="Times New Roman" w:hAnsi="Times New Roman" w:cs="Calibri"/>
+          <w:szCs w:val="24"/>
+          <w:lang w:val="fr-FR"/>
+        </w:rPr>
         <w:t>à</w:t>
       </w:r>
+      <w:proofErr w:type="spellEnd"/>
       <w:r>
         <w:rPr>
           <w:rFonts w:ascii="Times New Roman" w:hAnsi="Times New Roman"/>
           <w:szCs w:val="24"/>
           <w:lang w:val="fr-FR"/>
         </w:rPr>
-        <w:t xml:space="preserve"> th</w:t>
-      </w:r>
-      <w:r>
-        <w:rPr>
-          <w:rFonts w:ascii="Times New Roman" w:hAnsi="Times New Roman" w:cs="Calibri"/>
+        <w:t xml:space="preserve"> </w:t>
+      </w:r>
+      <w:proofErr w:type="spellStart"/>
+      <w:r>
+        <w:rPr>
+          <w:rFonts w:ascii="Times New Roman" w:hAnsi="Times New Roman"/>
           <w:szCs w:val="24"/>
           <w:lang w:val="fr-FR"/>
         </w:rPr>
+        <w:t>th</w:t>
+      </w:r>
+      <w:r>
+        <w:rPr>
+          <w:rFonts w:ascii="Times New Roman" w:hAnsi="Times New Roman" w:cs="Calibri"/>
+          <w:szCs w:val="24"/>
+          <w:lang w:val="fr-FR"/>
+        </w:rPr>
         <w:t>ờ</w:t>
       </w:r>
       <w:r>
@@ -3406,30 +5144,76 @@
           <w:szCs w:val="24"/>
           <w:lang w:val="fr-FR"/>
         </w:rPr>
-        <w:t>i gian ngh</w:t>
-      </w:r>
-      <w:r>
-        <w:rPr>
-          <w:rFonts w:ascii="Times New Roman" w:hAnsi="Times New Roman" w:cs="Calibri"/>
+        <w:t>i</w:t>
+      </w:r>
+      <w:proofErr w:type="spellEnd"/>
+      <w:r>
+        <w:rPr>
+          <w:rFonts w:ascii="Times New Roman" w:hAnsi="Times New Roman"/>
           <w:szCs w:val="24"/>
           <w:lang w:val="fr-FR"/>
         </w:rPr>
+        <w:t xml:space="preserve"> </w:t>
+      </w:r>
+      <w:proofErr w:type="spellStart"/>
+      <w:r>
+        <w:rPr>
+          <w:rFonts w:ascii="Times New Roman" w:hAnsi="Times New Roman"/>
+          <w:szCs w:val="24"/>
+          <w:lang w:val="fr-FR"/>
+        </w:rPr>
+        <w:t>gian</w:t>
+      </w:r>
+      <w:proofErr w:type="spellEnd"/>
+      <w:r>
+        <w:rPr>
+          <w:rFonts w:ascii="Times New Roman" w:hAnsi="Times New Roman"/>
+          <w:szCs w:val="24"/>
+          <w:lang w:val="fr-FR"/>
+        </w:rPr>
+        <w:t xml:space="preserve"> </w:t>
+      </w:r>
+      <w:proofErr w:type="spellStart"/>
+      <w:r>
+        <w:rPr>
+          <w:rFonts w:ascii="Times New Roman" w:hAnsi="Times New Roman"/>
+          <w:szCs w:val="24"/>
+          <w:lang w:val="fr-FR"/>
+        </w:rPr>
+        <w:t>ngh</w:t>
+      </w:r>
+      <w:r>
+        <w:rPr>
+          <w:rFonts w:ascii="Times New Roman" w:hAnsi="Times New Roman" w:cs="Calibri"/>
+          <w:szCs w:val="24"/>
+          <w:lang w:val="fr-FR"/>
+        </w:rPr>
         <w:t>ỉ</w:t>
       </w:r>
+      <w:proofErr w:type="spellEnd"/>
       <w:r>
         <w:rPr>
           <w:rFonts w:ascii="Times New Roman" w:hAnsi="Times New Roman"/>
           <w:szCs w:val="24"/>
           <w:lang w:val="fr-FR"/>
         </w:rPr>
-        <w:t xml:space="preserve"> ng</w:t>
-      </w:r>
-      <w:r>
-        <w:rPr>
-          <w:rFonts w:ascii="Times New Roman" w:hAnsi="Times New Roman" w:cs="Calibri"/>
+        <w:t xml:space="preserve"> </w:t>
+      </w:r>
+      <w:proofErr w:type="spellStart"/>
+      <w:r>
+        <w:rPr>
+          <w:rFonts w:ascii="Times New Roman" w:hAnsi="Times New Roman"/>
           <w:szCs w:val="24"/>
           <w:lang w:val="fr-FR"/>
         </w:rPr>
+        <w:t>ng</w:t>
+      </w:r>
+      <w:r>
+        <w:rPr>
+          <w:rFonts w:ascii="Times New Roman" w:hAnsi="Times New Roman" w:cs="Calibri"/>
+          <w:szCs w:val="24"/>
+          <w:lang w:val="fr-FR"/>
+        </w:rPr>
         <w:t>ơ</w:t>
       </w:r>
       <w:r>
@@ -3438,30 +5222,58 @@
           <w:szCs w:val="24"/>
           <w:lang w:val="fr-FR"/>
         </w:rPr>
-        <w:t>i, ngh</w:t>
-      </w:r>
-      <w:r>
-        <w:rPr>
-          <w:rFonts w:ascii="Times New Roman" w:hAnsi="Times New Roman" w:cs="Calibri"/>
+        <w:t>i</w:t>
+      </w:r>
+      <w:proofErr w:type="spellEnd"/>
+      <w:r>
+        <w:rPr>
+          <w:rFonts w:ascii="Times New Roman" w:hAnsi="Times New Roman"/>
           <w:szCs w:val="24"/>
           <w:lang w:val="fr-FR"/>
         </w:rPr>
+        <w:t xml:space="preserve">, </w:t>
+      </w:r>
+      <w:proofErr w:type="spellStart"/>
+      <w:r>
+        <w:rPr>
+          <w:rFonts w:ascii="Times New Roman" w:hAnsi="Times New Roman"/>
+          <w:szCs w:val="24"/>
+          <w:lang w:val="fr-FR"/>
+        </w:rPr>
+        <w:t>ngh</w:t>
+      </w:r>
+      <w:r>
+        <w:rPr>
+          <w:rFonts w:ascii="Times New Roman" w:hAnsi="Times New Roman" w:cs="Calibri"/>
+          <w:szCs w:val="24"/>
+          <w:lang w:val="fr-FR"/>
+        </w:rPr>
         <w:t>ỉ</w:t>
       </w:r>
+      <w:proofErr w:type="spellEnd"/>
       <w:r>
         <w:rPr>
           <w:rFonts w:ascii="Times New Roman" w:hAnsi="Times New Roman"/>
           <w:szCs w:val="24"/>
           <w:lang w:val="fr-FR"/>
         </w:rPr>
-        <w:t xml:space="preserve"> h</w:t>
-      </w:r>
-      <w:r>
-        <w:rPr>
-          <w:rFonts w:ascii="Times New Roman" w:hAnsi="Times New Roman" w:cs="Calibri"/>
+        <w:t xml:space="preserve"> </w:t>
+      </w:r>
+      <w:proofErr w:type="spellStart"/>
+      <w:r>
+        <w:rPr>
+          <w:rFonts w:ascii="Times New Roman" w:hAnsi="Times New Roman"/>
           <w:szCs w:val="24"/>
           <w:lang w:val="fr-FR"/>
         </w:rPr>
+        <w:t>h</w:t>
+      </w:r>
+      <w:r>
+        <w:rPr>
+          <w:rFonts w:ascii="Times New Roman" w:hAnsi="Times New Roman" w:cs="Calibri"/>
+          <w:szCs w:val="24"/>
+          <w:lang w:val="fr-FR"/>
+        </w:rPr>
         <w:t>à</w:t>
       </w:r>
       <w:r>
@@ -3470,7 +5282,332 @@
           <w:szCs w:val="24"/>
           <w:lang w:val="fr-FR"/>
         </w:rPr>
-        <w:t>ng năm: Theo nội quy, thỏa ước lao động tập thể của công ty và quy định của pháp luật.</w:t>
+        <w:t>ng</w:t>
+      </w:r>
+      <w:proofErr w:type="spellEnd"/>
+      <w:r>
+        <w:rPr>
+          <w:rFonts w:ascii="Times New Roman" w:hAnsi="Times New Roman"/>
+          <w:szCs w:val="24"/>
+          <w:lang w:val="fr-FR"/>
+        </w:rPr>
+        <w:t xml:space="preserve"> </w:t>
+      </w:r>
+      <w:proofErr w:type="spellStart"/>
+      <w:proofErr w:type="gramStart"/>
+      <w:r>
+        <w:rPr>
+          <w:rFonts w:ascii="Times New Roman" w:hAnsi="Times New Roman"/>
+          <w:szCs w:val="24"/>
+          <w:lang w:val="fr-FR"/>
+        </w:rPr>
+        <w:t>năm</w:t>
+      </w:r>
+      <w:proofErr w:type="spellEnd"/>
+      <w:r>
+        <w:rPr>
+          <w:rFonts w:ascii="Times New Roman" w:hAnsi="Times New Roman"/>
+          <w:szCs w:val="24"/>
+          <w:lang w:val="fr-FR"/>
+        </w:rPr>
+        <w:t>:</w:t>
+      </w:r>
+      <w:proofErr w:type="gramEnd"/>
+      <w:r>
+        <w:rPr>
+          <w:rFonts w:ascii="Times New Roman" w:hAnsi="Times New Roman"/>
+          <w:szCs w:val="24"/>
+          <w:lang w:val="fr-FR"/>
+        </w:rPr>
+        <w:t xml:space="preserve"> Theo </w:t>
+      </w:r>
+      <w:proofErr w:type="spellStart"/>
+      <w:r>
+        <w:rPr>
+          <w:rFonts w:ascii="Times New Roman" w:hAnsi="Times New Roman"/>
+          <w:szCs w:val="24"/>
+          <w:lang w:val="fr-FR"/>
+        </w:rPr>
+        <w:t>nội</w:t>
+      </w:r>
+      <w:proofErr w:type="spellEnd"/>
+      <w:r>
+        <w:rPr>
+          <w:rFonts w:ascii="Times New Roman" w:hAnsi="Times New Roman"/>
+          <w:szCs w:val="24"/>
+          <w:lang w:val="fr-FR"/>
+        </w:rPr>
+        <w:t xml:space="preserve"> </w:t>
+      </w:r>
+      <w:proofErr w:type="spellStart"/>
+      <w:r>
+        <w:rPr>
+          <w:rFonts w:ascii="Times New Roman" w:hAnsi="Times New Roman"/>
+          <w:szCs w:val="24"/>
+          <w:lang w:val="fr-FR"/>
+        </w:rPr>
+        <w:t>quy</w:t>
+      </w:r>
+      <w:proofErr w:type="spellEnd"/>
+      <w:r>
+        <w:rPr>
+          <w:rFonts w:ascii="Times New Roman" w:hAnsi="Times New Roman"/>
+          <w:szCs w:val="24"/>
+          <w:lang w:val="fr-FR"/>
+        </w:rPr>
+        <w:t xml:space="preserve">, </w:t>
+      </w:r>
+      <w:proofErr w:type="spellStart"/>
+      <w:r>
+        <w:rPr>
+          <w:rFonts w:ascii="Times New Roman" w:hAnsi="Times New Roman"/>
+          <w:szCs w:val="24"/>
+          <w:lang w:val="fr-FR"/>
+        </w:rPr>
+        <w:t>thỏa</w:t>
+      </w:r>
+      <w:proofErr w:type="spellEnd"/>
+      <w:r>
+        <w:rPr>
+          <w:rFonts w:ascii="Times New Roman" w:hAnsi="Times New Roman"/>
+          <w:szCs w:val="24"/>
+          <w:lang w:val="fr-FR"/>
+        </w:rPr>
+        <w:t xml:space="preserve"> </w:t>
+      </w:r>
+      <w:proofErr w:type="spellStart"/>
+      <w:r>
+        <w:rPr>
+          <w:rFonts w:ascii="Times New Roman" w:hAnsi="Times New Roman"/>
+          <w:szCs w:val="24"/>
+          <w:lang w:val="fr-FR"/>
+        </w:rPr>
+        <w:t>ước</w:t>
+      </w:r>
+      <w:proofErr w:type="spellEnd"/>
+      <w:r>
+        <w:rPr>
+          <w:rFonts w:ascii="Times New Roman" w:hAnsi="Times New Roman"/>
+          <w:szCs w:val="24"/>
+          <w:lang w:val="fr-FR"/>
+        </w:rPr>
+        <w:t xml:space="preserve"> lao </w:t>
+      </w:r>
+      <w:proofErr w:type="spellStart"/>
+      <w:r>
+        <w:rPr>
+          <w:rFonts w:ascii="Times New Roman" w:hAnsi="Times New Roman"/>
+          <w:szCs w:val="24"/>
+          <w:lang w:val="fr-FR"/>
+        </w:rPr>
+        <w:t>động</w:t>
+      </w:r>
+      <w:proofErr w:type="spellEnd"/>
+      <w:r>
+        <w:rPr>
+          <w:rFonts w:ascii="Times New Roman" w:hAnsi="Times New Roman"/>
+          <w:szCs w:val="24"/>
+          <w:lang w:val="fr-FR"/>
+        </w:rPr>
+        <w:t xml:space="preserve"> </w:t>
+      </w:r>
+      <w:proofErr w:type="spellStart"/>
+      <w:r>
+        <w:rPr>
+          <w:rFonts w:ascii="Times New Roman" w:hAnsi="Times New Roman"/>
+          <w:szCs w:val="24"/>
+          <w:lang w:val="fr-FR"/>
+        </w:rPr>
+        <w:t>tập</w:t>
+      </w:r>
+      <w:proofErr w:type="spellEnd"/>
+      <w:r>
+        <w:rPr>
+          <w:rFonts w:ascii="Times New Roman" w:hAnsi="Times New Roman"/>
+          <w:szCs w:val="24"/>
+          <w:lang w:val="fr-FR"/>
+        </w:rPr>
+        <w:t xml:space="preserve"> </w:t>
+      </w:r>
+      <w:proofErr w:type="spellStart"/>
+      <w:r>
+        <w:rPr>
+          <w:rFonts w:ascii="Times New Roman" w:hAnsi="Times New Roman"/>
+          <w:szCs w:val="24"/>
+          <w:lang w:val="fr-FR"/>
+        </w:rPr>
+        <w:t>thể</w:t>
+      </w:r>
+      <w:proofErr w:type="spellEnd"/>
+      <w:r>
+        <w:rPr>
+          <w:rFonts w:ascii="Times New Roman" w:hAnsi="Times New Roman"/>
+          <w:szCs w:val="24"/>
+          <w:lang w:val="fr-FR"/>
+        </w:rPr>
+        <w:t xml:space="preserve"> </w:t>
+      </w:r>
+      <w:proofErr w:type="spellStart"/>
+      <w:r>
+        <w:rPr>
+          <w:rFonts w:ascii="Times New Roman" w:hAnsi="Times New Roman"/>
+          <w:szCs w:val="24"/>
+          <w:lang w:val="fr-FR"/>
+        </w:rPr>
+        <w:t>của</w:t>
+      </w:r>
+      <w:proofErr w:type="spellEnd"/>
+      <w:r>
+        <w:rPr>
+          <w:rFonts w:ascii="Times New Roman" w:hAnsi="Times New Roman"/>
+          <w:szCs w:val="24"/>
+          <w:lang w:val="fr-FR"/>
+        </w:rPr>
+        <w:t xml:space="preserve"> </w:t>
+      </w:r>
+      <w:proofErr w:type="spellStart"/>
+      <w:r>
+        <w:rPr>
+          <w:rFonts w:ascii="Times New Roman" w:hAnsi="Times New Roman"/>
+          <w:szCs w:val="24"/>
+          <w:lang w:val="fr-FR"/>
+        </w:rPr>
+        <w:t>công</w:t>
+      </w:r>
+      <w:proofErr w:type="spellEnd"/>
+      <w:r>
+        <w:rPr>
+          <w:rFonts w:ascii="Times New Roman" w:hAnsi="Times New Roman"/>
+          <w:szCs w:val="24"/>
+          <w:lang w:val="fr-FR"/>
+        </w:rPr>
+        <w:t xml:space="preserve"> </w:t>
+      </w:r>
+      <w:proofErr w:type="spellStart"/>
+      <w:r>
+        <w:rPr>
+          <w:rFonts w:ascii="Times New Roman" w:hAnsi="Times New Roman"/>
+          <w:szCs w:val="24"/>
+          <w:lang w:val="fr-FR"/>
+        </w:rPr>
+        <w:t>ty</w:t>
+      </w:r>
+      <w:proofErr w:type="spellEnd"/>
+      <w:r>
+        <w:rPr>
+          <w:rFonts w:ascii="Times New Roman" w:hAnsi="Times New Roman"/>
+          <w:szCs w:val="24"/>
+          <w:lang w:val="fr-FR"/>
+        </w:rPr>
+        <w:t xml:space="preserve"> </w:t>
+      </w:r>
+      <w:proofErr w:type="spellStart"/>
+      <w:r>
+        <w:rPr>
+          <w:rFonts w:ascii="Times New Roman" w:hAnsi="Times New Roman"/>
+          <w:szCs w:val="24"/>
+          <w:lang w:val="fr-FR"/>
+        </w:rPr>
+        <w:t>và</w:t>
+      </w:r>
+      <w:proofErr w:type="spellEnd"/>
+      <w:r>
+        <w:rPr>
+          <w:rFonts w:ascii="Times New Roman" w:hAnsi="Times New Roman"/>
+          <w:szCs w:val="24"/>
+          <w:lang w:val="fr-FR"/>
+        </w:rPr>
+        <w:t xml:space="preserve"> </w:t>
+      </w:r>
+      <w:proofErr w:type="spellStart"/>
+      <w:r>
+        <w:rPr>
+          <w:rFonts w:ascii="Times New Roman" w:hAnsi="Times New Roman"/>
+          <w:szCs w:val="24"/>
+          <w:lang w:val="fr-FR"/>
+        </w:rPr>
+        <w:t>quy</w:t>
+      </w:r>
+      <w:proofErr w:type="spellEnd"/>
+      <w:r>
+        <w:rPr>
+          <w:rFonts w:ascii="Times New Roman" w:hAnsi="Times New Roman"/>
+          <w:szCs w:val="24"/>
+          <w:lang w:val="fr-FR"/>
+        </w:rPr>
+        <w:t xml:space="preserve"> </w:t>
+      </w:r>
+      <w:proofErr w:type="spellStart"/>
+      <w:r>
+        <w:rPr>
+          <w:rFonts w:ascii="Times New Roman" w:hAnsi="Times New Roman"/>
+          <w:szCs w:val="24"/>
+          <w:lang w:val="fr-FR"/>
+        </w:rPr>
+        <w:t>định</w:t>
+      </w:r>
+      <w:proofErr w:type="spellEnd"/>
+      <w:r>
+        <w:rPr>
+          <w:rFonts w:ascii="Times New Roman" w:hAnsi="Times New Roman"/>
+          <w:szCs w:val="24"/>
+          <w:lang w:val="fr-FR"/>
+        </w:rPr>
+        <w:t xml:space="preserve"> </w:t>
+      </w:r>
+      <w:proofErr w:type="spellStart"/>
+      <w:r>
+        <w:rPr>
+          <w:rFonts w:ascii="Times New Roman" w:hAnsi="Times New Roman"/>
+          <w:szCs w:val="24"/>
+          <w:lang w:val="fr-FR"/>
+        </w:rPr>
+        <w:t>của</w:t>
+      </w:r>
+      <w:proofErr w:type="spellEnd"/>
+      <w:r>
+        <w:rPr>
+          <w:rFonts w:ascii="Times New Roman" w:hAnsi="Times New Roman"/>
+          <w:szCs w:val="24"/>
+          <w:lang w:val="fr-FR"/>
+        </w:rPr>
+        <w:t xml:space="preserve"> </w:t>
+      </w:r>
+      <w:proofErr w:type="spellStart"/>
+      <w:r>
+        <w:rPr>
+          <w:rFonts w:ascii="Times New Roman" w:hAnsi="Times New Roman"/>
+          <w:szCs w:val="24"/>
+          <w:lang w:val="fr-FR"/>
+        </w:rPr>
+        <w:t>pháp</w:t>
+      </w:r>
+      <w:proofErr w:type="spellEnd"/>
+      <w:r>
+        <w:rPr>
+          <w:rFonts w:ascii="Times New Roman" w:hAnsi="Times New Roman"/>
+          <w:szCs w:val="24"/>
+          <w:lang w:val="fr-FR"/>
+        </w:rPr>
+        <w:t xml:space="preserve"> </w:t>
+      </w:r>
+      <w:proofErr w:type="spellStart"/>
+      <w:r>
+        <w:rPr>
+          <w:rFonts w:ascii="Times New Roman" w:hAnsi="Times New Roman"/>
+          <w:szCs w:val="24"/>
+          <w:lang w:val="fr-FR"/>
+        </w:rPr>
+        <w:t>luật</w:t>
+      </w:r>
+      <w:proofErr w:type="spellEnd"/>
+      <w:r>
+        <w:rPr>
+          <w:rFonts w:ascii="Times New Roman" w:hAnsi="Times New Roman"/>
+          <w:szCs w:val="24"/>
+          <w:lang w:val="fr-FR"/>
+        </w:rPr>
+        <w:t>.</w:t>
       </w:r>
     </w:p>
     <w:p>
@@ -3490,13 +5627,357 @@
           <w:lang w:val="fr-FR"/>
         </w:rPr>
       </w:pPr>
+      <w:proofErr w:type="spellStart"/>
       <w:r>
         <w:rPr>
           <w:rFonts w:ascii="Times New Roman" w:hAnsi="Times New Roman"/>
           <w:szCs w:val="24"/>
           <w:lang w:val="fr-FR"/>
         </w:rPr>
-        <w:t>Nghỉ Lễ, Tết, việc riêng có hưởng lương: Theo quy định của pháp luật và nội quy của công ty.</w:t>
+        <w:t>Nghỉ</w:t>
+      </w:r>
+      <w:proofErr w:type="spellEnd"/>
+      <w:r>
+        <w:rPr>
+          <w:rFonts w:ascii="Times New Roman" w:hAnsi="Times New Roman"/>
+          <w:szCs w:val="24"/>
+          <w:lang w:val="fr-FR"/>
+        </w:rPr>
+        <w:t xml:space="preserve"> </w:t>
+      </w:r>
+      <w:proofErr w:type="spellStart"/>
+      <w:r>
+        <w:rPr>
+          <w:rFonts w:ascii="Times New Roman" w:hAnsi="Times New Roman"/>
+          <w:szCs w:val="24"/>
+          <w:lang w:val="fr-FR"/>
+        </w:rPr>
+        <w:t>Lễ</w:t>
+      </w:r>
+      <w:proofErr w:type="spellEnd"/>
+      <w:r>
+        <w:rPr>
+          <w:rFonts w:ascii="Times New Roman" w:hAnsi="Times New Roman"/>
+          <w:szCs w:val="24"/>
+          <w:lang w:val="fr-FR"/>
+        </w:rPr>
+        <w:t xml:space="preserve">, </w:t>
+      </w:r>
+      <w:proofErr w:type="spellStart"/>
+      <w:r>
+        <w:rPr>
+          <w:rFonts w:ascii="Times New Roman" w:hAnsi="Times New Roman"/>
+          <w:szCs w:val="24"/>
+          <w:lang w:val="fr-FR"/>
+        </w:rPr>
+        <w:t>Tết</w:t>
+      </w:r>
+      <w:proofErr w:type="spellEnd"/>
+      <w:r>
+        <w:rPr>
+          <w:rFonts w:ascii="Times New Roman" w:hAnsi="Times New Roman"/>
+          <w:szCs w:val="24"/>
+          <w:lang w:val="fr-FR"/>
+        </w:rPr>
+        <w:t xml:space="preserve">, </w:t>
+      </w:r>
+      <w:proofErr w:type="spellStart"/>
+      <w:r>
+        <w:rPr>
+          <w:rFonts w:ascii="Times New Roman" w:hAnsi="Times New Roman"/>
+          <w:szCs w:val="24"/>
+          <w:lang w:val="fr-FR"/>
+        </w:rPr>
+        <w:t>việc</w:t>
+      </w:r>
+      <w:proofErr w:type="spellEnd"/>
+      <w:r>
+        <w:rPr>
+          <w:rFonts w:ascii="Times New Roman" w:hAnsi="Times New Roman"/>
+          <w:szCs w:val="24"/>
+          <w:lang w:val="fr-FR"/>
+        </w:rPr>
+        <w:t xml:space="preserve"> </w:t>
+      </w:r>
+      <w:proofErr w:type="spellStart"/>
+      <w:r>
+        <w:rPr>
+          <w:rFonts w:ascii="Times New Roman" w:hAnsi="Times New Roman"/>
+          <w:szCs w:val="24"/>
+          <w:lang w:val="fr-FR"/>
+        </w:rPr>
+        <w:t>riêng</w:t>
+      </w:r>
+      <w:proofErr w:type="spellEnd"/>
+      <w:r>
+        <w:rPr>
+          <w:rFonts w:ascii="Times New Roman" w:hAnsi="Times New Roman"/>
+          <w:szCs w:val="24"/>
+          <w:lang w:val="fr-FR"/>
+        </w:rPr>
+        <w:t xml:space="preserve"> </w:t>
+      </w:r>
+      <w:proofErr w:type="spellStart"/>
+      <w:r>
+        <w:rPr>
+          <w:rFonts w:ascii="Times New Roman" w:hAnsi="Times New Roman"/>
+          <w:szCs w:val="24"/>
+          <w:lang w:val="fr-FR"/>
+        </w:rPr>
+        <w:t>có</w:t>
+      </w:r>
+      <w:proofErr w:type="spellEnd"/>
+      <w:r>
+        <w:rPr>
+          <w:rFonts w:ascii="Times New Roman" w:hAnsi="Times New Roman"/>
+          <w:szCs w:val="24"/>
+          <w:lang w:val="fr-FR"/>
+        </w:rPr>
+        <w:t xml:space="preserve"> </w:t>
+      </w:r>
+      <w:proofErr w:type="spellStart"/>
+      <w:r>
+        <w:rPr>
+          <w:rFonts w:ascii="Times New Roman" w:hAnsi="Times New Roman"/>
+          <w:szCs w:val="24"/>
+          <w:lang w:val="fr-FR"/>
+        </w:rPr>
+        <w:t>hưởng</w:t>
+      </w:r>
+      <w:proofErr w:type="spellEnd"/>
+      <w:r>
+        <w:rPr>
+          <w:rFonts w:ascii="Times New Roman" w:hAnsi="Times New Roman"/>
+          <w:szCs w:val="24"/>
+          <w:lang w:val="fr-FR"/>
+        </w:rPr>
+        <w:t xml:space="preserve"> </w:t>
+      </w:r>
+      <w:proofErr w:type="spellStart"/>
+      <w:proofErr w:type="gramStart"/>
+      <w:r>
+        <w:rPr>
+          <w:rFonts w:ascii="Times New Roman" w:hAnsi="Times New Roman"/>
+          <w:szCs w:val="24"/>
+          <w:lang w:val="fr-FR"/>
+        </w:rPr>
+        <w:t>lương</w:t>
+      </w:r>
+      <w:proofErr w:type="spellEnd"/>
+      <w:r>
+        <w:rPr>
+          <w:rFonts w:ascii="Times New Roman" w:hAnsi="Times New Roman"/>
+          <w:szCs w:val="24"/>
+          <w:lang w:val="fr-FR"/>
+        </w:rPr>
+        <w:t>:</w:t>
+      </w:r>
+      <w:proofErr w:type="gramEnd"/>
+      <w:r>
+        <w:rPr>
+          <w:rFonts w:ascii="Times New Roman" w:hAnsi="Times New Roman"/>
+          <w:szCs w:val="24"/>
+          <w:lang w:val="fr-FR"/>
+        </w:rPr>
+        <w:t xml:space="preserve"> Theo </w:t>
+      </w:r>
+      <w:proofErr w:type="spellStart"/>
+      <w:r>
+        <w:rPr>
+          <w:rFonts w:ascii="Times New Roman" w:hAnsi="Times New Roman"/>
+          <w:szCs w:val="24"/>
+          <w:lang w:val="fr-FR"/>
+        </w:rPr>
+        <w:t>quy</w:t>
+      </w:r>
+      <w:proofErr w:type="spellEnd"/>
+      <w:r>
+        <w:rPr>
+          <w:rFonts w:ascii="Times New Roman" w:hAnsi="Times New Roman"/>
+          <w:szCs w:val="24"/>
+          <w:lang w:val="fr-FR"/>
+        </w:rPr>
+        <w:t xml:space="preserve"> </w:t>
+      </w:r>
+      <w:proofErr w:type="spellStart"/>
+      <w:r>
+        <w:rPr>
+          <w:rFonts w:ascii="Times New Roman" w:hAnsi="Times New Roman"/>
+          <w:szCs w:val="24"/>
+          <w:lang w:val="fr-FR"/>
+        </w:rPr>
+        <w:t>định</w:t>
+      </w:r>
+      <w:proofErr w:type="spellEnd"/>
+      <w:r>
+        <w:rPr>
+          <w:rFonts w:ascii="Times New Roman" w:hAnsi="Times New Roman"/>
+          <w:szCs w:val="24"/>
+          <w:lang w:val="fr-FR"/>
+        </w:rPr>
+        <w:t xml:space="preserve"> </w:t>
+      </w:r>
+      <w:proofErr w:type="spellStart"/>
+      <w:r>
+        <w:rPr>
+          <w:rFonts w:ascii="Times New Roman" w:hAnsi="Times New Roman"/>
+          <w:szCs w:val="24"/>
+          <w:lang w:val="fr-FR"/>
+        </w:rPr>
+        <w:t>của</w:t>
+      </w:r>
+      <w:proofErr w:type="spellEnd"/>
+      <w:r>
+        <w:rPr>
+          <w:rFonts w:ascii="Times New Roman" w:hAnsi="Times New Roman"/>
+          <w:szCs w:val="24"/>
+          <w:lang w:val="fr-FR"/>
+        </w:rPr>
+        <w:t xml:space="preserve"> </w:t>
+      </w:r>
+      <w:proofErr w:type="spellStart"/>
+      <w:r>
+        <w:rPr>
+          <w:rFonts w:ascii="Times New Roman" w:hAnsi="Times New Roman"/>
+          <w:szCs w:val="24"/>
+          <w:lang w:val="fr-FR"/>
+        </w:rPr>
+        <w:t>pháp</w:t>
+      </w:r>
+      <w:proofErr w:type="spellEnd"/>
+      <w:r>
+        <w:rPr>
+          <w:rFonts w:ascii="Times New Roman" w:hAnsi="Times New Roman"/>
+          <w:szCs w:val="24"/>
+          <w:lang w:val="fr-FR"/>
+        </w:rPr>
+        <w:t xml:space="preserve"> </w:t>
+      </w:r>
+      <w:proofErr w:type="spellStart"/>
+      <w:r>
+        <w:rPr>
+          <w:rFonts w:ascii="Times New Roman" w:hAnsi="Times New Roman"/>
+          <w:szCs w:val="24"/>
+          <w:lang w:val="fr-FR"/>
+        </w:rPr>
+        <w:t>luật</w:t>
+      </w:r>
+      <w:proofErr w:type="spellEnd"/>
+      <w:r>
+        <w:rPr>
+          <w:rFonts w:ascii="Times New Roman" w:hAnsi="Times New Roman"/>
+          <w:szCs w:val="24"/>
+          <w:lang w:val="fr-FR"/>
+        </w:rPr>
+        <w:t xml:space="preserve"> </w:t>
+      </w:r>
+      <w:proofErr w:type="spellStart"/>
+      <w:r>
+        <w:rPr>
+          <w:rFonts w:ascii="Times New Roman" w:hAnsi="Times New Roman"/>
+          <w:szCs w:val="24"/>
+          <w:lang w:val="fr-FR"/>
+        </w:rPr>
+        <w:t>và</w:t>
+      </w:r>
+      <w:proofErr w:type="spellEnd"/>
+      <w:r>
+        <w:rPr>
+          <w:rFonts w:ascii="Times New Roman" w:hAnsi="Times New Roman"/>
+          <w:szCs w:val="24"/>
+          <w:lang w:val="fr-FR"/>
+        </w:rPr>
+        <w:t xml:space="preserve"> </w:t>
+      </w:r>
+      <w:proofErr w:type="spellStart"/>
+      <w:r>
+        <w:rPr>
+          <w:rFonts w:ascii="Times New Roman" w:hAnsi="Times New Roman"/>
+          <w:szCs w:val="24"/>
+          <w:lang w:val="fr-FR"/>
+        </w:rPr>
+        <w:t>nội</w:t>
+      </w:r>
+      <w:proofErr w:type="spellEnd"/>
+      <w:r>
+        <w:rPr>
+          <w:rFonts w:ascii="Times New Roman" w:hAnsi="Times New Roman"/>
+          <w:szCs w:val="24"/>
+          <w:lang w:val="fr-FR"/>
+        </w:rPr>
+        <w:t xml:space="preserve"> </w:t>
+      </w:r>
+      <w:proofErr w:type="spellStart"/>
+      <w:r>
+        <w:rPr>
+          <w:rFonts w:ascii="Times New Roman" w:hAnsi="Times New Roman"/>
+          <w:szCs w:val="24"/>
+          <w:lang w:val="fr-FR"/>
+        </w:rPr>
+        <w:t>quy</w:t>
+      </w:r>
+      <w:proofErr w:type="spellEnd"/>
+      <w:r>
+        <w:rPr>
+          <w:rFonts w:ascii="Times New Roman" w:hAnsi="Times New Roman"/>
+          <w:szCs w:val="24"/>
+          <w:lang w:val="fr-FR"/>
+        </w:rPr>
+        <w:t xml:space="preserve"> </w:t>
+      </w:r>
+      <w:proofErr w:type="spellStart"/>
+      <w:r>
+        <w:rPr>
+          <w:rFonts w:ascii="Times New Roman" w:hAnsi="Times New Roman"/>
+          <w:szCs w:val="24"/>
+          <w:lang w:val="fr-FR"/>
+        </w:rPr>
+        <w:t>của</w:t>
+      </w:r>
+      <w:proofErr w:type="spellEnd"/>
+      <w:r>
+        <w:rPr>
+          <w:rFonts w:ascii="Times New Roman" w:hAnsi="Times New Roman"/>
+          <w:szCs w:val="24"/>
+          <w:lang w:val="fr-FR"/>
+        </w:rPr>
+        <w:t xml:space="preserve"> </w:t>
+      </w:r>
+      <w:proofErr w:type="spellStart"/>
+      <w:r>
+        <w:rPr>
+          <w:rFonts w:ascii="Times New Roman" w:hAnsi="Times New Roman"/>
+          <w:szCs w:val="24"/>
+          <w:lang w:val="fr-FR"/>
+        </w:rPr>
+        <w:t>công</w:t>
+      </w:r>
+      <w:proofErr w:type="spellEnd"/>
+      <w:r>
+        <w:rPr>
+          <w:rFonts w:ascii="Times New Roman" w:hAnsi="Times New Roman"/>
+          <w:szCs w:val="24"/>
+          <w:lang w:val="fr-FR"/>
+        </w:rPr>
+        <w:t xml:space="preserve"> </w:t>
+      </w:r>
+      <w:proofErr w:type="spellStart"/>
+      <w:r>
+        <w:rPr>
+          <w:rFonts w:ascii="Times New Roman" w:hAnsi="Times New Roman"/>
+          <w:szCs w:val="24"/>
+          <w:lang w:val="fr-FR"/>
+        </w:rPr>
+        <w:t>ty</w:t>
+      </w:r>
+      <w:proofErr w:type="spellEnd"/>
+      <w:r>
+        <w:rPr>
+          <w:rFonts w:ascii="Times New Roman" w:hAnsi="Times New Roman"/>
+          <w:szCs w:val="24"/>
+          <w:lang w:val="fr-FR"/>
+        </w:rPr>
+        <w:t>.</w:t>
       </w:r>
     </w:p>
     <w:p>
@@ -3521,8 +6002,21 @@
           <w:u w:val="single"/>
           <w:lang w:val="fr-FR"/>
         </w:rPr>
-        <w:t>ĐIỀU 3:</w:t>
-      </w:r>
+        <w:t xml:space="preserve">ĐIỀU </w:t>
+      </w:r>
+      <w:proofErr w:type="gramStart"/>
+      <w:r>
+        <w:rPr>
+          <w:rFonts w:ascii="Times New Roman" w:hAnsi="Times New Roman"/>
+          <w:b/>
+          <w:bCs/>
+          <w:szCs w:val="24"/>
+          <w:u w:val="single"/>
+          <w:lang w:val="fr-FR"/>
+        </w:rPr>
+        <w:t>3:</w:t>
+      </w:r>
+      <w:proofErr w:type="gramEnd"/>
       <w:r>
         <w:rPr>
           <w:rFonts w:ascii="Times New Roman" w:hAnsi="Times New Roman"/>
@@ -10233,7 +12727,25 @@
                 <w:szCs w:val="24"/>
                 <w:lang w:val="nl-NL"/>
               </w:rPr>
-              <w:t xml:space="preserve">            Công ty Cổ phần sản xuất Nam Thuận</w:t>
+              <w:t xml:space="preserve">            Công ty Cổ phần </w:t>
+            </w:r>
+            <w:r>
+              <w:rPr>
+                <w:rFonts w:ascii="Times New Roman" w:hAnsi="Times New Roman"/>
+                <w:b/>
+                <w:szCs w:val="24"/>
+                <w:lang w:val="nl-NL"/>
+              </w:rPr>
+              <w:t>S</w:t>
+            </w:r>
+            <w:r>
+              <w:rPr>
+                <w:rFonts w:ascii="Times New Roman" w:hAnsi="Times New Roman"/>
+                <w:b/>
+                <w:szCs w:val="24"/>
+                <w:lang w:val="nl-NL"/>
+              </w:rPr>
+              <w:t>ản xuất Nam Thuận</w:t>
             </w:r>
           </w:p>
         </w:tc>
@@ -12870,6 +15382,9 @@
   <wne:recipientData>
     <wne:active wne:val="1"/>
     <wne:hash wne:val="1707048493"/>
+  </wne:recipientData>
+  <wne:recipientData>
+    <wne:active wne:val="1"/>
   </wne:recipientData>
   <wne:recipientData>
     <wne:active wne:val="1"/>

</xml_diff>

<commit_message>
fix: Sửa lại thông tin địa chỉ trên HĐ theo địa chỉ mới sau sáp nhập
</commit_message>
<xml_diff>
--- a/static/uploads/mau/hopdong/nt1/hd6t.docx
+++ b/static/uploads/mau/hopdong/nt1/hd6t.docx
@@ -154,18 +154,8 @@
                 <w:b/>
                 <w:szCs w:val="24"/>
               </w:rPr>
-              <w:t xml:space="preserve"> </w:t>
-            </w:r>
-            <w:proofErr w:type="spellStart"/>
-            <w:r>
-              <w:rPr>
-                <w:rFonts w:ascii="Times New Roman" w:hAnsi="Times New Roman"/>
-                <w:b/>
-                <w:szCs w:val="24"/>
-              </w:rPr>
-              <w:t>phúc</w:t>
-            </w:r>
-            <w:proofErr w:type="spellEnd"/>
+              <w:t xml:space="preserve"> phúc</w:t>
+            </w:r>
           </w:p>
         </w:tc>
       </w:tr>
@@ -1506,7 +1496,21 @@
                 <w:rFonts w:ascii="Times New Roman" w:hAnsi="Times New Roman"/>
                 <w:lang w:val="nl-NL"/>
               </w:rPr>
-              <w:t>Tổ dân phố Thủy Sơn 7, phường Thủy Nguyên, thành phố Hải Phòng</w:t>
+              <w:t xml:space="preserve">Tổ dân phố Thủy Sơn </w:t>
+            </w:r>
+            <w:r>
+              <w:rPr>
+                <w:rFonts w:ascii="Times New Roman" w:hAnsi="Times New Roman"/>
+                <w:lang w:val="nl-NL"/>
+              </w:rPr>
+              <w:t>4</w:t>
+            </w:r>
+            <w:r>
+              <w:rPr>
+                <w:rFonts w:ascii="Times New Roman" w:hAnsi="Times New Roman"/>
+                <w:lang w:val="nl-NL"/>
+              </w:rPr>
+              <w:t>, phường Thủy Nguyên, thành phố Hải Phòng</w:t>
             </w:r>
           </w:p>
         </w:tc>
@@ -3483,7 +3487,23 @@
                 <w:szCs w:val="24"/>
                 <w:lang w:val="fr-FR"/>
               </w:rPr>
-              <w:t xml:space="preserve"> Sơn 7, </w:t>
+              <w:t xml:space="preserve"> Sơn </w:t>
+            </w:r>
+            <w:r>
+              <w:rPr>
+                <w:rFonts w:ascii="Times New Roman" w:hAnsi="Times New Roman"/>
+                <w:szCs w:val="24"/>
+                <w:lang w:val="fr-FR"/>
+              </w:rPr>
+              <w:t>4</w:t>
+            </w:r>
+            <w:r>
+              <w:rPr>
+                <w:rFonts w:ascii="Times New Roman" w:hAnsi="Times New Roman"/>
+                <w:szCs w:val="24"/>
+                <w:lang w:val="fr-FR"/>
+              </w:rPr>
+              <w:t xml:space="preserve">, </w:t>
             </w:r>
             <w:proofErr w:type="spellStart"/>
             <w:r>
@@ -15382,6 +15402,9 @@
   <wne:recipientData>
     <wne:active wne:val="1"/>
     <wne:hash wne:val="1707048493"/>
+  </wne:recipientData>
+  <wne:recipientData>
+    <wne:active wne:val="1"/>
   </wne:recipientData>
   <wne:recipientData>
     <wne:active wne:val="1"/>

</xml_diff>